<commit_message>
style: align contents index matching sample layout and place all 3 cropped figures in distinct sections
</commit_message>
<xml_diff>
--- a/PROJECT_REPORT_SIT_NAGPUR.docx
+++ b/PROJECT_REPORT_SIT_NAGPUR.docx
@@ -57,7 +57,6 @@
       </w:pPr>
       <w:r>
         <w:rPr>
-          <w:i w:val="0"/>
           <w:sz w:val="22"/>
         </w:rPr>
         <w:t>Submitted by</w:t>
@@ -148,7 +147,7 @@
     </w:p>
     <w:p>
       <w:pPr>
-        <w:spacing w:before="240" w:after="360"/>
+        <w:spacing w:before="320" w:after="400"/>
         <w:jc w:val="center"/>
       </w:pPr>
       <w:r>
@@ -159,1291 +158,2485 @@
         <w:t>CONTENTS</w:t>
       </w:r>
     </w:p>
-    <w:p>
-      <w:pPr>
-        <w:spacing w:after="40" w:line="276" w:lineRule="auto"/>
-      </w:pPr>
-      <w:r>
-        <w:rPr>
-          <w:b/>
-          <w:sz w:val="21"/>
-        </w:rPr>
-        <w:t>1. Title Page</w:t>
-      </w:r>
-      <w:r>
-        <w:rPr>
-          <w:color w:val="94A3B8"/>
-          <w:sz w:val="20"/>
-        </w:rPr>
-        <w:t xml:space="preserve"> ............................................................. </w:t>
-      </w:r>
-      <w:r>
-        <w:rPr>
-          <w:b/>
-          <w:sz w:val="21"/>
-        </w:rPr>
-        <w:t>1</w:t>
-      </w:r>
-    </w:p>
-    <w:p>
-      <w:pPr>
-        <w:spacing w:after="40" w:line="276" w:lineRule="auto"/>
-      </w:pPr>
-      <w:r>
-        <w:rPr>
-          <w:b/>
-          <w:sz w:val="21"/>
-        </w:rPr>
-        <w:t>2. Abstract</w:t>
-      </w:r>
-      <w:r>
-        <w:rPr>
-          <w:color w:val="94A3B8"/>
-          <w:sz w:val="20"/>
-        </w:rPr>
-        <w:t xml:space="preserve"> ............................................................... </w:t>
-      </w:r>
-      <w:r>
-        <w:rPr>
-          <w:b/>
-          <w:sz w:val="21"/>
-        </w:rPr>
-        <w:t>3</w:t>
-      </w:r>
-    </w:p>
-    <w:p>
-      <w:pPr>
-        <w:spacing w:after="40" w:line="276" w:lineRule="auto"/>
-      </w:pPr>
-      <w:r>
-        <w:rPr>
-          <w:b/>
-          <w:sz w:val="21"/>
-        </w:rPr>
-        <w:t>3. Keywords</w:t>
-      </w:r>
-      <w:r>
-        <w:rPr>
-          <w:color w:val="94A3B8"/>
-          <w:sz w:val="20"/>
-        </w:rPr>
-        <w:t xml:space="preserve"> ............................................................... </w:t>
-      </w:r>
-      <w:r>
-        <w:rPr>
-          <w:b/>
-          <w:sz w:val="21"/>
-        </w:rPr>
-        <w:t>3</w:t>
-      </w:r>
-    </w:p>
-    <w:p>
-      <w:pPr>
-        <w:spacing w:after="40" w:line="276" w:lineRule="auto"/>
-      </w:pPr>
-      <w:r>
-        <w:rPr>
-          <w:b/>
-          <w:sz w:val="21"/>
-        </w:rPr>
-        <w:t>4. Introduction</w:t>
-      </w:r>
-      <w:r>
-        <w:rPr>
-          <w:color w:val="94A3B8"/>
-          <w:sz w:val="20"/>
-        </w:rPr>
-        <w:t xml:space="preserve"> ........................................................... </w:t>
-      </w:r>
-      <w:r>
-        <w:rPr>
-          <w:b/>
-          <w:sz w:val="21"/>
-        </w:rPr>
-        <w:t>4</w:t>
-      </w:r>
-    </w:p>
-    <w:p>
-      <w:pPr>
-        <w:spacing w:after="40" w:line="276" w:lineRule="auto"/>
-      </w:pPr>
-      <w:r>
-        <w:rPr>
-          <w:sz w:val="21"/>
-        </w:rPr>
-        <w:t xml:space="preserve">    4.1 Background</w:t>
-      </w:r>
-      <w:r>
-        <w:rPr>
-          <w:color w:val="94A3B8"/>
-          <w:sz w:val="20"/>
-        </w:rPr>
-        <w:t xml:space="preserve"> ........................................................ </w:t>
-      </w:r>
-      <w:r>
-        <w:rPr>
-          <w:b/>
-          <w:sz w:val="21"/>
-        </w:rPr>
-        <w:t>4</w:t>
-      </w:r>
-    </w:p>
-    <w:p>
-      <w:pPr>
-        <w:spacing w:after="40" w:line="276" w:lineRule="auto"/>
-      </w:pPr>
-      <w:r>
-        <w:rPr>
-          <w:sz w:val="21"/>
-        </w:rPr>
-        <w:t xml:space="preserve">    4.2 Battery State of Health</w:t>
-      </w:r>
-      <w:r>
-        <w:rPr>
-          <w:color w:val="94A3B8"/>
-          <w:sz w:val="20"/>
-        </w:rPr>
-        <w:t xml:space="preserve"> ........................................... </w:t>
-      </w:r>
-      <w:r>
-        <w:rPr>
-          <w:b/>
-          <w:sz w:val="21"/>
-        </w:rPr>
-        <w:t>4</w:t>
-      </w:r>
-    </w:p>
-    <w:p>
-      <w:pPr>
-        <w:spacing w:after="40" w:line="276" w:lineRule="auto"/>
-      </w:pPr>
-      <w:r>
-        <w:rPr>
-          <w:sz w:val="21"/>
-        </w:rPr>
-        <w:t xml:space="preserve">    4.3 Randomized Battery Usage</w:t>
-      </w:r>
-      <w:r>
-        <w:rPr>
-          <w:color w:val="94A3B8"/>
-          <w:sz w:val="20"/>
-        </w:rPr>
-        <w:t xml:space="preserve"> .......................................... </w:t>
-      </w:r>
-      <w:r>
-        <w:rPr>
-          <w:b/>
-          <w:sz w:val="21"/>
-        </w:rPr>
-        <w:t>5</w:t>
-      </w:r>
-    </w:p>
-    <w:p>
-      <w:pPr>
-        <w:spacing w:after="40" w:line="276" w:lineRule="auto"/>
-      </w:pPr>
-      <w:r>
-        <w:rPr>
-          <w:sz w:val="21"/>
-        </w:rPr>
-        <w:t xml:space="preserve">    4.4 Motivation</w:t>
-      </w:r>
-      <w:r>
-        <w:rPr>
-          <w:color w:val="94A3B8"/>
-          <w:sz w:val="20"/>
-        </w:rPr>
-        <w:t xml:space="preserve"> ........................................................ </w:t>
-      </w:r>
-      <w:r>
-        <w:rPr>
-          <w:b/>
-          <w:sz w:val="21"/>
-        </w:rPr>
-        <w:t>5</w:t>
-      </w:r>
-    </w:p>
-    <w:p>
-      <w:pPr>
-        <w:spacing w:after="40" w:line="276" w:lineRule="auto"/>
-      </w:pPr>
-      <w:r>
-        <w:rPr>
-          <w:sz w:val="21"/>
-        </w:rPr>
-        <w:t xml:space="preserve">    4.5 Problem Statement</w:t>
-      </w:r>
-      <w:r>
-        <w:rPr>
-          <w:color w:val="94A3B8"/>
-          <w:sz w:val="20"/>
-        </w:rPr>
-        <w:t xml:space="preserve"> ................................................. </w:t>
-      </w:r>
-      <w:r>
-        <w:rPr>
-          <w:b/>
-          <w:sz w:val="21"/>
-        </w:rPr>
-        <w:t>5</w:t>
-      </w:r>
-    </w:p>
-    <w:p>
-      <w:pPr>
-        <w:spacing w:after="40" w:line="276" w:lineRule="auto"/>
-      </w:pPr>
-      <w:r>
-        <w:rPr>
-          <w:sz w:val="21"/>
-        </w:rPr>
-        <w:t xml:space="preserve">    4.6 Objectives of the Project</w:t>
-      </w:r>
-      <w:r>
-        <w:rPr>
-          <w:color w:val="94A3B8"/>
-          <w:sz w:val="20"/>
-        </w:rPr>
-        <w:t xml:space="preserve"> ......................................... </w:t>
-      </w:r>
-      <w:r>
-        <w:rPr>
-          <w:b/>
-          <w:sz w:val="21"/>
-        </w:rPr>
-        <w:t>6</w:t>
-      </w:r>
-    </w:p>
-    <w:p>
-      <w:pPr>
-        <w:spacing w:after="40" w:line="276" w:lineRule="auto"/>
-      </w:pPr>
-      <w:r>
-        <w:rPr>
-          <w:sz w:val="21"/>
-        </w:rPr>
-        <w:t xml:space="preserve">    4.7 Research Question</w:t>
-      </w:r>
-      <w:r>
-        <w:rPr>
-          <w:color w:val="94A3B8"/>
-          <w:sz w:val="20"/>
-        </w:rPr>
-        <w:t xml:space="preserve"> ................................................. </w:t>
-      </w:r>
-      <w:r>
-        <w:rPr>
-          <w:b/>
-          <w:sz w:val="21"/>
-        </w:rPr>
-        <w:t>6</w:t>
-      </w:r>
-    </w:p>
-    <w:p>
-      <w:pPr>
-        <w:spacing w:after="40" w:line="276" w:lineRule="auto"/>
-      </w:pPr>
-      <w:r>
-        <w:rPr>
-          <w:sz w:val="21"/>
-        </w:rPr>
-        <w:t xml:space="preserve">    4.8 Research Hypothesis</w:t>
-      </w:r>
-      <w:r>
-        <w:rPr>
-          <w:color w:val="94A3B8"/>
-          <w:sz w:val="20"/>
-        </w:rPr>
-        <w:t xml:space="preserve"> ............................................... </w:t>
-      </w:r>
-      <w:r>
-        <w:rPr>
-          <w:b/>
-          <w:sz w:val="21"/>
-        </w:rPr>
-        <w:t>6</w:t>
-      </w:r>
-    </w:p>
-    <w:p>
-      <w:pPr>
-        <w:spacing w:after="40" w:line="276" w:lineRule="auto"/>
-      </w:pPr>
-      <w:r>
-        <w:rPr>
-          <w:sz w:val="21"/>
-        </w:rPr>
-        <w:t xml:space="preserve">    4.9 Scope of the Project</w:t>
-      </w:r>
-      <w:r>
-        <w:rPr>
-          <w:color w:val="94A3B8"/>
-          <w:sz w:val="20"/>
-        </w:rPr>
-        <w:t xml:space="preserve"> .............................................. </w:t>
-      </w:r>
-      <w:r>
-        <w:rPr>
-          <w:b/>
-          <w:sz w:val="21"/>
-        </w:rPr>
-        <w:t>7</w:t>
-      </w:r>
-    </w:p>
-    <w:p>
-      <w:pPr>
-        <w:spacing w:after="40" w:line="276" w:lineRule="auto"/>
-      </w:pPr>
-      <w:r>
-        <w:rPr>
-          <w:sz w:val="21"/>
-        </w:rPr>
-        <w:t xml:space="preserve">    4.10 Novelty and Contribution of the Project</w:t>
-      </w:r>
-      <w:r>
-        <w:rPr>
-          <w:color w:val="94A3B8"/>
-          <w:sz w:val="20"/>
-        </w:rPr>
-        <w:t xml:space="preserve"> .......................... </w:t>
-      </w:r>
-      <w:r>
-        <w:rPr>
-          <w:b/>
-          <w:sz w:val="21"/>
-        </w:rPr>
-        <w:t>7</w:t>
-      </w:r>
-    </w:p>
-    <w:p>
-      <w:pPr>
-        <w:spacing w:after="40" w:line="276" w:lineRule="auto"/>
-      </w:pPr>
-      <w:r>
-        <w:rPr>
-          <w:sz w:val="21"/>
-        </w:rPr>
-        <w:t xml:space="preserve">    4.11 Organization of the Report</w:t>
-      </w:r>
-      <w:r>
-        <w:rPr>
-          <w:color w:val="94A3B8"/>
-          <w:sz w:val="20"/>
-        </w:rPr>
-        <w:t xml:space="preserve"> ....................................... </w:t>
-      </w:r>
-      <w:r>
-        <w:rPr>
-          <w:b/>
-          <w:sz w:val="21"/>
-        </w:rPr>
-        <w:t>7</w:t>
-      </w:r>
-    </w:p>
-    <w:p>
-      <w:pPr>
-        <w:spacing w:after="40" w:line="276" w:lineRule="auto"/>
-      </w:pPr>
-      <w:r>
-        <w:rPr>
-          <w:sz w:val="21"/>
-        </w:rPr>
-        <w:t xml:space="preserve">    4.12 Expected Research Outcome</w:t>
-      </w:r>
-      <w:r>
-        <w:rPr>
-          <w:color w:val="94A3B8"/>
-          <w:sz w:val="20"/>
-        </w:rPr>
-        <w:t xml:space="preserve"> ........................................ </w:t>
-      </w:r>
-      <w:r>
-        <w:rPr>
-          <w:b/>
-          <w:sz w:val="21"/>
-        </w:rPr>
-        <w:t>8</w:t>
-      </w:r>
-    </w:p>
-    <w:p>
-      <w:pPr>
-        <w:spacing w:after="40" w:line="276" w:lineRule="auto"/>
-      </w:pPr>
-      <w:r>
-        <w:rPr>
-          <w:b/>
-          <w:sz w:val="21"/>
-        </w:rPr>
-        <w:t>5. Literature Review / Related Work</w:t>
-      </w:r>
-      <w:r>
-        <w:rPr>
-          <w:color w:val="94A3B8"/>
-          <w:sz w:val="20"/>
-        </w:rPr>
-        <w:t xml:space="preserve"> ....................................... </w:t>
-      </w:r>
-      <w:r>
-        <w:rPr>
-          <w:b/>
-          <w:sz w:val="21"/>
-        </w:rPr>
-        <w:t>9</w:t>
-      </w:r>
-    </w:p>
-    <w:p>
-      <w:pPr>
-        <w:spacing w:after="40" w:line="276" w:lineRule="auto"/>
-      </w:pPr>
-      <w:r>
-        <w:rPr>
-          <w:sz w:val="21"/>
-        </w:rPr>
-        <w:t xml:space="preserve">    5.1 Traditional Approaches to Battery SoH Estimation</w:t>
-      </w:r>
-      <w:r>
-        <w:rPr>
-          <w:color w:val="94A3B8"/>
-          <w:sz w:val="20"/>
-        </w:rPr>
-        <w:t xml:space="preserve"> .................. </w:t>
-      </w:r>
-      <w:r>
-        <w:rPr>
-          <w:b/>
-          <w:sz w:val="21"/>
-        </w:rPr>
-        <w:t>9</w:t>
-      </w:r>
-    </w:p>
-    <w:p>
-      <w:pPr>
-        <w:spacing w:after="40" w:line="276" w:lineRule="auto"/>
-      </w:pPr>
-      <w:r>
-        <w:rPr>
-          <w:sz w:val="21"/>
-        </w:rPr>
-        <w:t xml:space="preserve">    5.2 Machine Learning-Based SoH Estimation</w:t>
-      </w:r>
-      <w:r>
-        <w:rPr>
-          <w:color w:val="94A3B8"/>
-          <w:sz w:val="20"/>
-        </w:rPr>
-        <w:t xml:space="preserve"> ............................. </w:t>
-      </w:r>
-      <w:r>
-        <w:rPr>
-          <w:b/>
-          <w:sz w:val="21"/>
-        </w:rPr>
-        <w:t>9</w:t>
-      </w:r>
-    </w:p>
-    <w:p>
-      <w:pPr>
-        <w:spacing w:after="40" w:line="276" w:lineRule="auto"/>
-      </w:pPr>
-      <w:r>
-        <w:rPr>
-          <w:sz w:val="21"/>
-        </w:rPr>
-        <w:t xml:space="preserve">    5.3 Feature Engineering for SoH Estimation</w:t>
-      </w:r>
-      <w:r>
-        <w:rPr>
-          <w:color w:val="94A3B8"/>
-          <w:sz w:val="20"/>
-        </w:rPr>
-        <w:t xml:space="preserve"> ............................ </w:t>
-      </w:r>
-      <w:r>
-        <w:rPr>
-          <w:b/>
-          <w:sz w:val="21"/>
-        </w:rPr>
-        <w:t>9</w:t>
-      </w:r>
-    </w:p>
-    <w:p>
-      <w:pPr>
-        <w:spacing w:after="40" w:line="276" w:lineRule="auto"/>
-      </w:pPr>
-      <w:r>
-        <w:rPr>
-          <w:sz w:val="21"/>
-        </w:rPr>
-        <w:t xml:space="preserve">    5.4 Deep Learning for Battery SoH Estimation</w:t>
-      </w:r>
-      <w:r>
-        <w:rPr>
-          <w:color w:val="94A3B8"/>
-          <w:sz w:val="20"/>
-        </w:rPr>
-        <w:t xml:space="preserve"> ......................... </w:t>
-      </w:r>
-      <w:r>
-        <w:rPr>
-          <w:b/>
-          <w:sz w:val="21"/>
-        </w:rPr>
-        <w:t>10</w:t>
-      </w:r>
-    </w:p>
-    <w:p>
-      <w:pPr>
-        <w:spacing w:after="40" w:line="276" w:lineRule="auto"/>
-      </w:pPr>
-      <w:r>
-        <w:rPr>
-          <w:sz w:val="21"/>
-        </w:rPr>
-        <w:t xml:space="preserve">    5.5 Explainable Artificial Intelligence</w:t>
-      </w:r>
-      <w:r>
-        <w:rPr>
-          <w:color w:val="94A3B8"/>
-          <w:sz w:val="20"/>
-        </w:rPr>
-        <w:t xml:space="preserve"> .............................. </w:t>
-      </w:r>
-      <w:r>
-        <w:rPr>
-          <w:b/>
-          <w:sz w:val="21"/>
-        </w:rPr>
-        <w:t>10</w:t>
-      </w:r>
-    </w:p>
-    <w:p>
-      <w:pPr>
-        <w:spacing w:after="40" w:line="276" w:lineRule="auto"/>
-      </w:pPr>
-      <w:r>
-        <w:rPr>
-          <w:sz w:val="21"/>
-        </w:rPr>
-        <w:t xml:space="preserve">    5.6 Recent Explainable ML Research</w:t>
-      </w:r>
-      <w:r>
-        <w:rPr>
-          <w:color w:val="94A3B8"/>
-          <w:sz w:val="20"/>
-        </w:rPr>
-        <w:t xml:space="preserve"> ................................... </w:t>
-      </w:r>
-      <w:r>
-        <w:rPr>
-          <w:b/>
-          <w:sz w:val="21"/>
-        </w:rPr>
-        <w:t>10</w:t>
-      </w:r>
-    </w:p>
-    <w:p>
-      <w:pPr>
-        <w:spacing w:after="40" w:line="276" w:lineRule="auto"/>
-      </w:pPr>
-      <w:r>
-        <w:rPr>
-          <w:sz w:val="21"/>
-        </w:rPr>
-        <w:t xml:space="preserve">    5.7 Randomized Battery Usage in Existing Research</w:t>
-      </w:r>
-      <w:r>
-        <w:rPr>
-          <w:color w:val="94A3B8"/>
-          <w:sz w:val="20"/>
-        </w:rPr>
-        <w:t xml:space="preserve"> .................... </w:t>
-      </w:r>
-      <w:r>
-        <w:rPr>
-          <w:b/>
-          <w:sz w:val="21"/>
-        </w:rPr>
-        <w:t>10</w:t>
-      </w:r>
-    </w:p>
-    <w:p>
-      <w:pPr>
-        <w:spacing w:after="40" w:line="276" w:lineRule="auto"/>
-      </w:pPr>
-      <w:r>
-        <w:rPr>
-          <w:sz w:val="21"/>
-        </w:rPr>
-        <w:t xml:space="preserve">    5.8 Comparison of Existing Research (Table 1)</w:t>
-      </w:r>
-      <w:r>
-        <w:rPr>
-          <w:color w:val="94A3B8"/>
-          <w:sz w:val="20"/>
-        </w:rPr>
-        <w:t xml:space="preserve"> ........................ </w:t>
-      </w:r>
-      <w:r>
-        <w:rPr>
-          <w:b/>
-          <w:sz w:val="21"/>
-        </w:rPr>
-        <w:t>11</w:t>
-      </w:r>
-    </w:p>
-    <w:p>
-      <w:pPr>
-        <w:spacing w:after="40" w:line="276" w:lineRule="auto"/>
-      </w:pPr>
-      <w:r>
-        <w:rPr>
-          <w:sz w:val="21"/>
-        </w:rPr>
-        <w:t xml:space="preserve">    5.9 Discussion of Existing Work</w:t>
-      </w:r>
-      <w:r>
-        <w:rPr>
-          <w:color w:val="94A3B8"/>
-          <w:sz w:val="20"/>
-        </w:rPr>
-        <w:t xml:space="preserve"> ...................................... </w:t>
-      </w:r>
-      <w:r>
-        <w:rPr>
-          <w:b/>
-          <w:sz w:val="21"/>
-        </w:rPr>
-        <w:t>11</w:t>
-      </w:r>
-    </w:p>
-    <w:p>
-      <w:pPr>
-        <w:spacing w:after="40" w:line="276" w:lineRule="auto"/>
-      </w:pPr>
-      <w:r>
-        <w:rPr>
-          <w:sz w:val="21"/>
-        </w:rPr>
-        <w:t xml:space="preserve">    5.10 Limitations Identified in Existing Research</w:t>
-      </w:r>
-      <w:r>
-        <w:rPr>
-          <w:color w:val="94A3B8"/>
-          <w:sz w:val="20"/>
-        </w:rPr>
-        <w:t xml:space="preserve"> ..................... </w:t>
-      </w:r>
-      <w:r>
-        <w:rPr>
-          <w:b/>
-          <w:sz w:val="21"/>
-        </w:rPr>
-        <w:t>12</w:t>
-      </w:r>
-    </w:p>
-    <w:p>
-      <w:pPr>
-        <w:spacing w:after="40" w:line="276" w:lineRule="auto"/>
-      </w:pPr>
-      <w:r>
-        <w:rPr>
-          <w:sz w:val="21"/>
-        </w:rPr>
-        <w:t xml:space="preserve">    5.11 Research Gap</w:t>
-      </w:r>
-      <w:r>
-        <w:rPr>
-          <w:color w:val="94A3B8"/>
-          <w:sz w:val="20"/>
-        </w:rPr>
-        <w:t xml:space="preserve"> .................................................... </w:t>
-      </w:r>
-      <w:r>
-        <w:rPr>
-          <w:b/>
-          <w:sz w:val="21"/>
-        </w:rPr>
-        <w:t>12</w:t>
-      </w:r>
-    </w:p>
-    <w:p>
-      <w:pPr>
-        <w:spacing w:after="40" w:line="276" w:lineRule="auto"/>
-      </w:pPr>
-      <w:r>
-        <w:rPr>
-          <w:sz w:val="21"/>
-        </w:rPr>
-        <w:t xml:space="preserve">    5.12 Research Gap Addressed by the Present Project</w:t>
-      </w:r>
-      <w:r>
-        <w:rPr>
-          <w:color w:val="94A3B8"/>
-          <w:sz w:val="20"/>
-        </w:rPr>
-        <w:t xml:space="preserve"> ................... </w:t>
-      </w:r>
-      <w:r>
-        <w:rPr>
-          <w:b/>
-          <w:sz w:val="21"/>
-        </w:rPr>
-        <w:t>12</w:t>
-      </w:r>
-    </w:p>
-    <w:p>
-      <w:pPr>
-        <w:spacing w:after="40" w:line="276" w:lineRule="auto"/>
-      </w:pPr>
-      <w:r>
-        <w:rPr>
-          <w:sz w:val="21"/>
-        </w:rPr>
-        <w:t xml:space="preserve">    5.13 Positioning of the Present Work</w:t>
-      </w:r>
-      <w:r>
-        <w:rPr>
-          <w:color w:val="94A3B8"/>
-          <w:sz w:val="20"/>
-        </w:rPr>
-        <w:t xml:space="preserve"> ................................. </w:t>
-      </w:r>
-      <w:r>
-        <w:rPr>
-          <w:b/>
-          <w:sz w:val="21"/>
-        </w:rPr>
-        <w:t>13</w:t>
-      </w:r>
-    </w:p>
-    <w:p>
-      <w:pPr>
-        <w:spacing w:after="40" w:line="276" w:lineRule="auto"/>
-      </w:pPr>
-      <w:r>
-        <w:rPr>
-          <w:sz w:val="21"/>
-        </w:rPr>
-        <w:t xml:space="preserve">    5.14 Summary of Literature Review</w:t>
-      </w:r>
-      <w:r>
-        <w:rPr>
-          <w:color w:val="94A3B8"/>
-          <w:sz w:val="20"/>
-        </w:rPr>
-        <w:t xml:space="preserve"> .................................... </w:t>
-      </w:r>
-      <w:r>
-        <w:rPr>
-          <w:b/>
-          <w:sz w:val="21"/>
-        </w:rPr>
-        <w:t>13</w:t>
-      </w:r>
-    </w:p>
-    <w:p>
-      <w:pPr>
-        <w:spacing w:after="40" w:line="276" w:lineRule="auto"/>
-      </w:pPr>
-      <w:r>
-        <w:rPr>
-          <w:b/>
-          <w:sz w:val="21"/>
-        </w:rPr>
-        <w:t>6. Methodology / Proposed System</w:t>
-      </w:r>
-      <w:r>
-        <w:rPr>
-          <w:color w:val="94A3B8"/>
-          <w:sz w:val="20"/>
-        </w:rPr>
-        <w:t xml:space="preserve"> ......................................... </w:t>
-      </w:r>
-      <w:r>
-        <w:rPr>
-          <w:b/>
-          <w:sz w:val="21"/>
-        </w:rPr>
-        <w:t>14</w:t>
-      </w:r>
-    </w:p>
-    <w:p>
-      <w:pPr>
-        <w:spacing w:after="40" w:line="276" w:lineRule="auto"/>
-      </w:pPr>
-      <w:r>
-        <w:rPr>
-          <w:sz w:val="21"/>
-        </w:rPr>
-        <w:t xml:space="preserve">    6.1 Proposed Methodology (Figure 1)</w:t>
-      </w:r>
-      <w:r>
-        <w:rPr>
-          <w:color w:val="94A3B8"/>
-          <w:sz w:val="20"/>
-        </w:rPr>
-        <w:t xml:space="preserve"> .................................. </w:t>
-      </w:r>
-      <w:r>
-        <w:rPr>
-          <w:b/>
-          <w:sz w:val="21"/>
-        </w:rPr>
-        <w:t>14</w:t>
-      </w:r>
-    </w:p>
-    <w:p>
-      <w:pPr>
-        <w:spacing w:after="40" w:line="276" w:lineRule="auto"/>
-      </w:pPr>
-      <w:r>
-        <w:rPr>
-          <w:sz w:val="21"/>
-        </w:rPr>
-        <w:t xml:space="preserve">    6.2 Data Collection and Preparation</w:t>
-      </w:r>
-      <w:r>
-        <w:rPr>
-          <w:color w:val="94A3B8"/>
-          <w:sz w:val="20"/>
-        </w:rPr>
-        <w:t xml:space="preserve"> .................................. </w:t>
-      </w:r>
-      <w:r>
-        <w:rPr>
-          <w:b/>
-          <w:sz w:val="21"/>
-        </w:rPr>
-        <w:t>14</w:t>
-      </w:r>
-    </w:p>
-    <w:p>
-      <w:pPr>
-        <w:spacing w:after="40" w:line="276" w:lineRule="auto"/>
-      </w:pPr>
-      <w:r>
-        <w:rPr>
-          <w:sz w:val="21"/>
-        </w:rPr>
-        <w:t xml:space="preserve">    6.3 State of Health Calculation</w:t>
-      </w:r>
-      <w:r>
-        <w:rPr>
-          <w:color w:val="94A3B8"/>
-          <w:sz w:val="20"/>
-        </w:rPr>
-        <w:t xml:space="preserve"> ...................................... </w:t>
-      </w:r>
-      <w:r>
-        <w:rPr>
-          <w:b/>
-          <w:sz w:val="21"/>
-        </w:rPr>
-        <w:t>15</w:t>
-      </w:r>
-    </w:p>
-    <w:p>
-      <w:pPr>
-        <w:spacing w:after="40" w:line="276" w:lineRule="auto"/>
-      </w:pPr>
-      <w:r>
-        <w:rPr>
-          <w:sz w:val="21"/>
-        </w:rPr>
-        <w:t xml:space="preserve">    6.4 Feature Engineering (Table of Features)</w:t>
-      </w:r>
-      <w:r>
-        <w:rPr>
-          <w:color w:val="94A3B8"/>
-          <w:sz w:val="20"/>
-        </w:rPr>
-        <w:t xml:space="preserve"> .......................... </w:t>
-      </w:r>
-      <w:r>
-        <w:rPr>
-          <w:b/>
-          <w:sz w:val="21"/>
-        </w:rPr>
-        <w:t>15</w:t>
-      </w:r>
-    </w:p>
-    <w:p>
-      <w:pPr>
-        <w:spacing w:after="40" w:line="276" w:lineRule="auto"/>
-      </w:pPr>
-      <w:r>
-        <w:rPr>
-          <w:sz w:val="21"/>
-        </w:rPr>
-        <w:t xml:space="preserve">    6.5 Data Cleaning and Preprocessing</w:t>
-      </w:r>
-      <w:r>
-        <w:rPr>
-          <w:color w:val="94A3B8"/>
-          <w:sz w:val="20"/>
-        </w:rPr>
-        <w:t xml:space="preserve"> .................................. </w:t>
-      </w:r>
-      <w:r>
-        <w:rPr>
-          <w:b/>
-          <w:sz w:val="21"/>
-        </w:rPr>
-        <w:t>15</w:t>
-      </w:r>
-    </w:p>
-    <w:p>
-      <w:pPr>
-        <w:spacing w:after="40" w:line="276" w:lineRule="auto"/>
-      </w:pPr>
-      <w:r>
-        <w:rPr>
-          <w:sz w:val="21"/>
-        </w:rPr>
-        <w:t xml:space="preserve">    6.6 Model Design (Figure 2 &amp; Figure 3)</w:t>
-      </w:r>
-      <w:r>
-        <w:rPr>
-          <w:color w:val="94A3B8"/>
-          <w:sz w:val="20"/>
-        </w:rPr>
-        <w:t xml:space="preserve"> ............................... </w:t>
-      </w:r>
-      <w:r>
-        <w:rPr>
-          <w:b/>
-          <w:sz w:val="21"/>
-        </w:rPr>
-        <w:t>16</w:t>
-      </w:r>
-    </w:p>
-    <w:p>
-      <w:pPr>
-        <w:spacing w:after="40" w:line="276" w:lineRule="auto"/>
-      </w:pPr>
-      <w:r>
-        <w:rPr>
-          <w:sz w:val="21"/>
-        </w:rPr>
-        <w:t xml:space="preserve">    6.7 Training and Evaluation</w:t>
-      </w:r>
-      <w:r>
-        <w:rPr>
-          <w:color w:val="94A3B8"/>
-          <w:sz w:val="20"/>
-        </w:rPr>
-        <w:t xml:space="preserve"> .......................................... </w:t>
-      </w:r>
-      <w:r>
-        <w:rPr>
-          <w:b/>
-          <w:sz w:val="21"/>
-        </w:rPr>
-        <w:t>16</w:t>
-      </w:r>
-    </w:p>
-    <w:p>
-      <w:pPr>
-        <w:spacing w:after="40" w:line="276" w:lineRule="auto"/>
-      </w:pPr>
-      <w:r>
-        <w:rPr>
-          <w:sz w:val="21"/>
-        </w:rPr>
-        <w:t xml:space="preserve">    6.8 Explainability</w:t>
-      </w:r>
-      <w:r>
-        <w:rPr>
-          <w:color w:val="94A3B8"/>
-          <w:sz w:val="20"/>
-        </w:rPr>
-        <w:t xml:space="preserve"> ................................................... </w:t>
-      </w:r>
-      <w:r>
-        <w:rPr>
-          <w:b/>
-          <w:sz w:val="21"/>
-        </w:rPr>
-        <w:t>17</w:t>
-      </w:r>
-    </w:p>
-    <w:p>
-      <w:pPr>
-        <w:spacing w:after="40" w:line="276" w:lineRule="auto"/>
-      </w:pPr>
-      <w:r>
-        <w:rPr>
-          <w:sz w:val="21"/>
-        </w:rPr>
-        <w:t xml:space="preserve">    6.9 Methodology Summary</w:t>
-      </w:r>
-      <w:r>
-        <w:rPr>
-          <w:color w:val="94A3B8"/>
-          <w:sz w:val="20"/>
-        </w:rPr>
-        <w:t xml:space="preserve"> .............................................. </w:t>
-      </w:r>
-      <w:r>
-        <w:rPr>
-          <w:b/>
-          <w:sz w:val="21"/>
-        </w:rPr>
-        <w:t>17</w:t>
-      </w:r>
-    </w:p>
-    <w:p>
-      <w:pPr>
-        <w:spacing w:after="40" w:line="276" w:lineRule="auto"/>
-      </w:pPr>
-      <w:r>
-        <w:rPr>
-          <w:b/>
-          <w:sz w:val="21"/>
-        </w:rPr>
-        <w:t>7. Implementation</w:t>
-      </w:r>
-      <w:r>
-        <w:rPr>
-          <w:color w:val="94A3B8"/>
-          <w:sz w:val="20"/>
-        </w:rPr>
-        <w:t xml:space="preserve"> ........................................................ </w:t>
-      </w:r>
-      <w:r>
-        <w:rPr>
-          <w:b/>
-          <w:sz w:val="21"/>
-        </w:rPr>
-        <w:t>18</w:t>
-      </w:r>
-    </w:p>
-    <w:p>
-      <w:pPr>
-        <w:spacing w:after="40" w:line="276" w:lineRule="auto"/>
-      </w:pPr>
-      <w:r>
-        <w:rPr>
-          <w:b/>
-          <w:sz w:val="21"/>
-        </w:rPr>
-        <w:t>8. Results and Discussion</w:t>
-      </w:r>
-      <w:r>
-        <w:rPr>
-          <w:color w:val="94A3B8"/>
-          <w:sz w:val="20"/>
-        </w:rPr>
-        <w:t xml:space="preserve"> ................................................ </w:t>
-      </w:r>
-      <w:r>
-        <w:rPr>
-          <w:b/>
-          <w:sz w:val="21"/>
-        </w:rPr>
-        <w:t>19</w:t>
-      </w:r>
-    </w:p>
-    <w:p>
-      <w:pPr>
-        <w:spacing w:after="40" w:line="276" w:lineRule="auto"/>
-      </w:pPr>
-      <w:r>
-        <w:rPr>
-          <w:sz w:val="21"/>
-        </w:rPr>
-        <w:t xml:space="preserve">    8.1 Experimental Results (Figure 8.1, Figure 8.2, Table 8.1, Table 8.2)</w:t>
-      </w:r>
-      <w:r>
-        <w:rPr>
-          <w:color w:val="94A3B8"/>
-          <w:sz w:val="20"/>
-        </w:rPr>
-        <w:t xml:space="preserve"> ..... </w:t>
-      </w:r>
-      <w:r>
-        <w:rPr>
-          <w:b/>
-          <w:sz w:val="21"/>
-        </w:rPr>
-        <w:t>19</w:t>
-      </w:r>
-    </w:p>
-    <w:p>
-      <w:pPr>
-        <w:spacing w:after="40" w:line="276" w:lineRule="auto"/>
-      </w:pPr>
-      <w:r>
-        <w:rPr>
-          <w:sz w:val="21"/>
-        </w:rPr>
-        <w:t xml:space="preserve">    8.2 Battery-Wise Generalization (Table 8.3)</w:t>
-      </w:r>
-      <w:r>
-        <w:rPr>
-          <w:color w:val="94A3B8"/>
-          <w:sz w:val="20"/>
-        </w:rPr>
-        <w:t xml:space="preserve"> .......................... </w:t>
-      </w:r>
-      <w:r>
-        <w:rPr>
-          <w:b/>
-          <w:sz w:val="21"/>
-        </w:rPr>
-        <w:t>20</w:t>
-      </w:r>
-    </w:p>
-    <w:p>
-      <w:pPr>
-        <w:spacing w:after="40" w:line="276" w:lineRule="auto"/>
-      </w:pPr>
-      <w:r>
-        <w:rPr>
-          <w:sz w:val="21"/>
-        </w:rPr>
-        <w:t xml:space="preserve">    8.3 Explainability Results (Table 8.4, Figure 8.3, Figure 8.4)</w:t>
-      </w:r>
-      <w:r>
-        <w:rPr>
-          <w:color w:val="94A3B8"/>
-          <w:sz w:val="20"/>
-        </w:rPr>
-        <w:t xml:space="preserve"> ....... </w:t>
-      </w:r>
-      <w:r>
-        <w:rPr>
-          <w:b/>
-          <w:sz w:val="21"/>
-        </w:rPr>
-        <w:t>21</w:t>
-      </w:r>
-    </w:p>
-    <w:p>
-      <w:pPr>
-        <w:spacing w:after="40" w:line="276" w:lineRule="auto"/>
-      </w:pPr>
-      <w:r>
-        <w:rPr>
-          <w:sz w:val="21"/>
-        </w:rPr>
-        <w:t xml:space="preserve">    8.4 Discussion</w:t>
-      </w:r>
-      <w:r>
-        <w:rPr>
-          <w:color w:val="94A3B8"/>
-          <w:sz w:val="20"/>
-        </w:rPr>
-        <w:t xml:space="preserve"> ....................................................... </w:t>
-      </w:r>
-      <w:r>
-        <w:rPr>
-          <w:b/>
-          <w:sz w:val="21"/>
-        </w:rPr>
-        <w:t>21</w:t>
-      </w:r>
-    </w:p>
-    <w:p>
-      <w:pPr>
-        <w:spacing w:after="40" w:line="276" w:lineRule="auto"/>
-      </w:pPr>
-      <w:r>
-        <w:rPr>
-          <w:b/>
-          <w:sz w:val="21"/>
-        </w:rPr>
-        <w:t>9. Conclusion and Future Work</w:t>
-      </w:r>
-      <w:r>
-        <w:rPr>
-          <w:color w:val="94A3B8"/>
-          <w:sz w:val="20"/>
-        </w:rPr>
-        <w:t xml:space="preserve"> ............................................ </w:t>
-      </w:r>
-      <w:r>
-        <w:rPr>
-          <w:b/>
-          <w:sz w:val="21"/>
-        </w:rPr>
-        <w:t>22</w:t>
-      </w:r>
-    </w:p>
-    <w:p>
-      <w:pPr>
-        <w:spacing w:after="40" w:line="276" w:lineRule="auto"/>
-      </w:pPr>
-      <w:r>
-        <w:rPr>
-          <w:sz w:val="21"/>
-        </w:rPr>
-        <w:t xml:space="preserve">    9.1 Conclusion</w:t>
-      </w:r>
-      <w:r>
-        <w:rPr>
-          <w:color w:val="94A3B8"/>
-          <w:sz w:val="20"/>
-        </w:rPr>
-        <w:t xml:space="preserve"> ....................................................... </w:t>
-      </w:r>
-      <w:r>
-        <w:rPr>
-          <w:b/>
-          <w:sz w:val="21"/>
-        </w:rPr>
-        <w:t>22</w:t>
-      </w:r>
-    </w:p>
-    <w:p>
-      <w:pPr>
-        <w:spacing w:after="40" w:line="276" w:lineRule="auto"/>
-      </w:pPr>
-      <w:r>
-        <w:rPr>
-          <w:sz w:val="21"/>
-        </w:rPr>
-        <w:t xml:space="preserve">    9.2 Limitations and Future Work</w:t>
-      </w:r>
-      <w:r>
-        <w:rPr>
-          <w:color w:val="94A3B8"/>
-          <w:sz w:val="20"/>
-        </w:rPr>
-        <w:t xml:space="preserve"> ...................................... </w:t>
-      </w:r>
-      <w:r>
-        <w:rPr>
-          <w:b/>
-          <w:sz w:val="21"/>
-        </w:rPr>
-        <w:t>22</w:t>
-      </w:r>
-    </w:p>
-    <w:p>
-      <w:pPr>
-        <w:spacing w:after="40" w:line="276" w:lineRule="auto"/>
-      </w:pPr>
-      <w:r>
-        <w:rPr>
-          <w:b/>
-          <w:sz w:val="21"/>
-        </w:rPr>
-        <w:t>10. References</w:t>
-      </w:r>
-      <w:r>
-        <w:rPr>
-          <w:color w:val="94A3B8"/>
-          <w:sz w:val="20"/>
-        </w:rPr>
-        <w:t xml:space="preserve"> ........................................................... </w:t>
-      </w:r>
-      <w:r>
-        <w:rPr>
-          <w:b/>
-          <w:sz w:val="21"/>
-        </w:rPr>
-        <w:t>23</w:t>
-      </w:r>
-    </w:p>
+    <w:tbl>
+      <w:tblPr>
+        <w:tblW w:type="auto" w:w="0"/>
+        <w:jc w:val="center"/>
+        <w:tblLook w:firstColumn="1" w:firstRow="1" w:lastColumn="0" w:lastRow="0" w:noHBand="0" w:noVBand="1" w:val="04A0"/>
+      </w:tblPr>
+      <w:tblGrid>
+        <w:gridCol w:w="4680"/>
+        <w:gridCol w:w="4680"/>
+      </w:tblGrid>
+      <w:tr>
+        <w:tc>
+          <w:tcPr>
+            <w:tcW w:type="dxa" w:w="7920"/>
+            <w:tcBorders>
+              <w:top w:val="none"/>
+              <w:left w:val="none"/>
+              <w:bottom w:val="none"/>
+              <w:right w:val="none"/>
+            </w:tcBorders>
+          </w:tcPr>
+          <w:p>
+            <w:pPr>
+              <w:spacing w:before="20" w:after="40"/>
+              <w:jc w:val="left"/>
+            </w:pPr>
+            <w:r>
+              <w:rPr>
+                <w:b/>
+                <w:sz w:val="21"/>
+              </w:rPr>
+              <w:t>1. Title Page</w:t>
+            </w:r>
+          </w:p>
+        </w:tc>
+        <w:tc>
+          <w:tcPr>
+            <w:tcW w:type="dxa" w:w="1440"/>
+            <w:tcBorders>
+              <w:top w:val="none"/>
+              <w:left w:val="none"/>
+              <w:bottom w:val="none"/>
+              <w:right w:val="none"/>
+            </w:tcBorders>
+          </w:tcPr>
+          <w:p>
+            <w:pPr>
+              <w:spacing w:before="20" w:after="40"/>
+              <w:jc w:val="right"/>
+            </w:pPr>
+            <w:r>
+              <w:rPr>
+                <w:b/>
+                <w:sz w:val="21"/>
+              </w:rPr>
+              <w:t>1</w:t>
+            </w:r>
+          </w:p>
+        </w:tc>
+      </w:tr>
+      <w:tr>
+        <w:tc>
+          <w:tcPr>
+            <w:tcW w:type="dxa" w:w="7920"/>
+            <w:tcBorders>
+              <w:top w:val="none"/>
+              <w:left w:val="none"/>
+              <w:bottom w:val="none"/>
+              <w:right w:val="none"/>
+            </w:tcBorders>
+          </w:tcPr>
+          <w:p>
+            <w:pPr>
+              <w:spacing w:before="20" w:after="40"/>
+              <w:jc w:val="left"/>
+            </w:pPr>
+            <w:r>
+              <w:rPr>
+                <w:b/>
+                <w:sz w:val="21"/>
+              </w:rPr>
+              <w:t>2. Abstract</w:t>
+            </w:r>
+          </w:p>
+        </w:tc>
+        <w:tc>
+          <w:tcPr>
+            <w:tcW w:type="dxa" w:w="1440"/>
+            <w:tcBorders>
+              <w:top w:val="none"/>
+              <w:left w:val="none"/>
+              <w:bottom w:val="none"/>
+              <w:right w:val="none"/>
+            </w:tcBorders>
+          </w:tcPr>
+          <w:p>
+            <w:pPr>
+              <w:spacing w:before="20" w:after="40"/>
+              <w:jc w:val="right"/>
+            </w:pPr>
+            <w:r>
+              <w:rPr>
+                <w:b/>
+                <w:sz w:val="21"/>
+              </w:rPr>
+              <w:t>3</w:t>
+            </w:r>
+          </w:p>
+        </w:tc>
+      </w:tr>
+      <w:tr>
+        <w:tc>
+          <w:tcPr>
+            <w:tcW w:type="dxa" w:w="7920"/>
+            <w:tcBorders>
+              <w:top w:val="none"/>
+              <w:left w:val="none"/>
+              <w:bottom w:val="none"/>
+              <w:right w:val="none"/>
+            </w:tcBorders>
+          </w:tcPr>
+          <w:p>
+            <w:pPr>
+              <w:spacing w:before="20" w:after="40"/>
+              <w:jc w:val="left"/>
+            </w:pPr>
+            <w:r>
+              <w:rPr>
+                <w:b/>
+                <w:sz w:val="21"/>
+              </w:rPr>
+              <w:t>3. Keywords</w:t>
+            </w:r>
+          </w:p>
+        </w:tc>
+        <w:tc>
+          <w:tcPr>
+            <w:tcW w:type="dxa" w:w="1440"/>
+            <w:tcBorders>
+              <w:top w:val="none"/>
+              <w:left w:val="none"/>
+              <w:bottom w:val="none"/>
+              <w:right w:val="none"/>
+            </w:tcBorders>
+          </w:tcPr>
+          <w:p>
+            <w:pPr>
+              <w:spacing w:before="20" w:after="40"/>
+              <w:jc w:val="right"/>
+            </w:pPr>
+            <w:r>
+              <w:rPr>
+                <w:b/>
+                <w:sz w:val="21"/>
+              </w:rPr>
+              <w:t>3</w:t>
+            </w:r>
+          </w:p>
+        </w:tc>
+      </w:tr>
+      <w:tr>
+        <w:tc>
+          <w:tcPr>
+            <w:tcW w:type="dxa" w:w="7920"/>
+            <w:tcBorders>
+              <w:top w:val="none"/>
+              <w:left w:val="none"/>
+              <w:bottom w:val="none"/>
+              <w:right w:val="none"/>
+            </w:tcBorders>
+          </w:tcPr>
+          <w:p>
+            <w:pPr>
+              <w:spacing w:before="20" w:after="40"/>
+              <w:jc w:val="left"/>
+            </w:pPr>
+            <w:r>
+              <w:rPr>
+                <w:b/>
+                <w:sz w:val="21"/>
+              </w:rPr>
+              <w:t>4. Introduction</w:t>
+            </w:r>
+          </w:p>
+        </w:tc>
+        <w:tc>
+          <w:tcPr>
+            <w:tcW w:type="dxa" w:w="1440"/>
+            <w:tcBorders>
+              <w:top w:val="none"/>
+              <w:left w:val="none"/>
+              <w:bottom w:val="none"/>
+              <w:right w:val="none"/>
+            </w:tcBorders>
+          </w:tcPr>
+          <w:p>
+            <w:pPr>
+              <w:spacing w:before="20" w:after="40"/>
+              <w:jc w:val="right"/>
+            </w:pPr>
+            <w:r>
+              <w:rPr>
+                <w:b/>
+                <w:sz w:val="21"/>
+              </w:rPr>
+              <w:t>4</w:t>
+            </w:r>
+          </w:p>
+        </w:tc>
+      </w:tr>
+      <w:tr>
+        <w:tc>
+          <w:tcPr>
+            <w:tcW w:type="dxa" w:w="7920"/>
+            <w:tcBorders>
+              <w:top w:val="none"/>
+              <w:left w:val="none"/>
+              <w:bottom w:val="none"/>
+              <w:right w:val="none"/>
+            </w:tcBorders>
+          </w:tcPr>
+          <w:p>
+            <w:pPr>
+              <w:spacing w:before="20" w:after="40"/>
+              <w:jc w:val="left"/>
+            </w:pPr>
+            <w:r>
+              <w:rPr>
+                <w:sz w:val="21"/>
+              </w:rPr>
+              <w:t xml:space="preserve">    4.1 Background</w:t>
+            </w:r>
+          </w:p>
+        </w:tc>
+        <w:tc>
+          <w:tcPr>
+            <w:tcW w:type="dxa" w:w="1440"/>
+            <w:tcBorders>
+              <w:top w:val="none"/>
+              <w:left w:val="none"/>
+              <w:bottom w:val="none"/>
+              <w:right w:val="none"/>
+            </w:tcBorders>
+          </w:tcPr>
+          <w:p>
+            <w:pPr>
+              <w:spacing w:before="20" w:after="40"/>
+              <w:jc w:val="right"/>
+            </w:pPr>
+            <w:r>
+              <w:rPr>
+                <w:sz w:val="21"/>
+              </w:rPr>
+              <w:t>4</w:t>
+            </w:r>
+          </w:p>
+        </w:tc>
+      </w:tr>
+      <w:tr>
+        <w:tc>
+          <w:tcPr>
+            <w:tcW w:type="dxa" w:w="7920"/>
+            <w:tcBorders>
+              <w:top w:val="none"/>
+              <w:left w:val="none"/>
+              <w:bottom w:val="none"/>
+              <w:right w:val="none"/>
+            </w:tcBorders>
+          </w:tcPr>
+          <w:p>
+            <w:pPr>
+              <w:spacing w:before="20" w:after="40"/>
+              <w:jc w:val="left"/>
+            </w:pPr>
+            <w:r>
+              <w:rPr>
+                <w:sz w:val="21"/>
+              </w:rPr>
+              <w:t xml:space="preserve">    4.2 Battery State of Health</w:t>
+            </w:r>
+          </w:p>
+        </w:tc>
+        <w:tc>
+          <w:tcPr>
+            <w:tcW w:type="dxa" w:w="1440"/>
+            <w:tcBorders>
+              <w:top w:val="none"/>
+              <w:left w:val="none"/>
+              <w:bottom w:val="none"/>
+              <w:right w:val="none"/>
+            </w:tcBorders>
+          </w:tcPr>
+          <w:p>
+            <w:pPr>
+              <w:spacing w:before="20" w:after="40"/>
+              <w:jc w:val="right"/>
+            </w:pPr>
+            <w:r>
+              <w:rPr>
+                <w:sz w:val="21"/>
+              </w:rPr>
+              <w:t>4</w:t>
+            </w:r>
+          </w:p>
+        </w:tc>
+      </w:tr>
+      <w:tr>
+        <w:tc>
+          <w:tcPr>
+            <w:tcW w:type="dxa" w:w="7920"/>
+            <w:tcBorders>
+              <w:top w:val="none"/>
+              <w:left w:val="none"/>
+              <w:bottom w:val="none"/>
+              <w:right w:val="none"/>
+            </w:tcBorders>
+          </w:tcPr>
+          <w:p>
+            <w:pPr>
+              <w:spacing w:before="20" w:after="40"/>
+              <w:jc w:val="left"/>
+            </w:pPr>
+            <w:r>
+              <w:rPr>
+                <w:sz w:val="21"/>
+              </w:rPr>
+              <w:t xml:space="preserve">    4.3 Randomized Battery Usage</w:t>
+            </w:r>
+          </w:p>
+        </w:tc>
+        <w:tc>
+          <w:tcPr>
+            <w:tcW w:type="dxa" w:w="1440"/>
+            <w:tcBorders>
+              <w:top w:val="none"/>
+              <w:left w:val="none"/>
+              <w:bottom w:val="none"/>
+              <w:right w:val="none"/>
+            </w:tcBorders>
+          </w:tcPr>
+          <w:p>
+            <w:pPr>
+              <w:spacing w:before="20" w:after="40"/>
+              <w:jc w:val="right"/>
+            </w:pPr>
+            <w:r>
+              <w:rPr>
+                <w:sz w:val="21"/>
+              </w:rPr>
+              <w:t>5</w:t>
+            </w:r>
+          </w:p>
+        </w:tc>
+      </w:tr>
+      <w:tr>
+        <w:tc>
+          <w:tcPr>
+            <w:tcW w:type="dxa" w:w="7920"/>
+            <w:tcBorders>
+              <w:top w:val="none"/>
+              <w:left w:val="none"/>
+              <w:bottom w:val="none"/>
+              <w:right w:val="none"/>
+            </w:tcBorders>
+          </w:tcPr>
+          <w:p>
+            <w:pPr>
+              <w:spacing w:before="20" w:after="40"/>
+              <w:jc w:val="left"/>
+            </w:pPr>
+            <w:r>
+              <w:rPr>
+                <w:sz w:val="21"/>
+              </w:rPr>
+              <w:t xml:space="preserve">    4.4 Motivation</w:t>
+            </w:r>
+          </w:p>
+        </w:tc>
+        <w:tc>
+          <w:tcPr>
+            <w:tcW w:type="dxa" w:w="1440"/>
+            <w:tcBorders>
+              <w:top w:val="none"/>
+              <w:left w:val="none"/>
+              <w:bottom w:val="none"/>
+              <w:right w:val="none"/>
+            </w:tcBorders>
+          </w:tcPr>
+          <w:p>
+            <w:pPr>
+              <w:spacing w:before="20" w:after="40"/>
+              <w:jc w:val="right"/>
+            </w:pPr>
+            <w:r>
+              <w:rPr>
+                <w:sz w:val="21"/>
+              </w:rPr>
+              <w:t>5</w:t>
+            </w:r>
+          </w:p>
+        </w:tc>
+      </w:tr>
+      <w:tr>
+        <w:tc>
+          <w:tcPr>
+            <w:tcW w:type="dxa" w:w="7920"/>
+            <w:tcBorders>
+              <w:top w:val="none"/>
+              <w:left w:val="none"/>
+              <w:bottom w:val="none"/>
+              <w:right w:val="none"/>
+            </w:tcBorders>
+          </w:tcPr>
+          <w:p>
+            <w:pPr>
+              <w:spacing w:before="20" w:after="40"/>
+              <w:jc w:val="left"/>
+            </w:pPr>
+            <w:r>
+              <w:rPr>
+                <w:sz w:val="21"/>
+              </w:rPr>
+              <w:t xml:space="preserve">    4.5 Problem Statement</w:t>
+            </w:r>
+          </w:p>
+        </w:tc>
+        <w:tc>
+          <w:tcPr>
+            <w:tcW w:type="dxa" w:w="1440"/>
+            <w:tcBorders>
+              <w:top w:val="none"/>
+              <w:left w:val="none"/>
+              <w:bottom w:val="none"/>
+              <w:right w:val="none"/>
+            </w:tcBorders>
+          </w:tcPr>
+          <w:p>
+            <w:pPr>
+              <w:spacing w:before="20" w:after="40"/>
+              <w:jc w:val="right"/>
+            </w:pPr>
+            <w:r>
+              <w:rPr>
+                <w:sz w:val="21"/>
+              </w:rPr>
+              <w:t>5</w:t>
+            </w:r>
+          </w:p>
+        </w:tc>
+      </w:tr>
+      <w:tr>
+        <w:tc>
+          <w:tcPr>
+            <w:tcW w:type="dxa" w:w="7920"/>
+            <w:tcBorders>
+              <w:top w:val="none"/>
+              <w:left w:val="none"/>
+              <w:bottom w:val="none"/>
+              <w:right w:val="none"/>
+            </w:tcBorders>
+          </w:tcPr>
+          <w:p>
+            <w:pPr>
+              <w:spacing w:before="20" w:after="40"/>
+              <w:jc w:val="left"/>
+            </w:pPr>
+            <w:r>
+              <w:rPr>
+                <w:sz w:val="21"/>
+              </w:rPr>
+              <w:t xml:space="preserve">    4.6 Objectives of the Project</w:t>
+            </w:r>
+          </w:p>
+        </w:tc>
+        <w:tc>
+          <w:tcPr>
+            <w:tcW w:type="dxa" w:w="1440"/>
+            <w:tcBorders>
+              <w:top w:val="none"/>
+              <w:left w:val="none"/>
+              <w:bottom w:val="none"/>
+              <w:right w:val="none"/>
+            </w:tcBorders>
+          </w:tcPr>
+          <w:p>
+            <w:pPr>
+              <w:spacing w:before="20" w:after="40"/>
+              <w:jc w:val="right"/>
+            </w:pPr>
+            <w:r>
+              <w:rPr>
+                <w:sz w:val="21"/>
+              </w:rPr>
+              <w:t>6</w:t>
+            </w:r>
+          </w:p>
+        </w:tc>
+      </w:tr>
+      <w:tr>
+        <w:tc>
+          <w:tcPr>
+            <w:tcW w:type="dxa" w:w="7920"/>
+            <w:tcBorders>
+              <w:top w:val="none"/>
+              <w:left w:val="none"/>
+              <w:bottom w:val="none"/>
+              <w:right w:val="none"/>
+            </w:tcBorders>
+          </w:tcPr>
+          <w:p>
+            <w:pPr>
+              <w:spacing w:before="20" w:after="40"/>
+              <w:jc w:val="left"/>
+            </w:pPr>
+            <w:r>
+              <w:rPr>
+                <w:sz w:val="21"/>
+              </w:rPr>
+              <w:t xml:space="preserve">    4.7 Research Question</w:t>
+            </w:r>
+          </w:p>
+        </w:tc>
+        <w:tc>
+          <w:tcPr>
+            <w:tcW w:type="dxa" w:w="1440"/>
+            <w:tcBorders>
+              <w:top w:val="none"/>
+              <w:left w:val="none"/>
+              <w:bottom w:val="none"/>
+              <w:right w:val="none"/>
+            </w:tcBorders>
+          </w:tcPr>
+          <w:p>
+            <w:pPr>
+              <w:spacing w:before="20" w:after="40"/>
+              <w:jc w:val="right"/>
+            </w:pPr>
+            <w:r>
+              <w:rPr>
+                <w:sz w:val="21"/>
+              </w:rPr>
+              <w:t>6</w:t>
+            </w:r>
+          </w:p>
+        </w:tc>
+      </w:tr>
+      <w:tr>
+        <w:tc>
+          <w:tcPr>
+            <w:tcW w:type="dxa" w:w="7920"/>
+            <w:tcBorders>
+              <w:top w:val="none"/>
+              <w:left w:val="none"/>
+              <w:bottom w:val="none"/>
+              <w:right w:val="none"/>
+            </w:tcBorders>
+          </w:tcPr>
+          <w:p>
+            <w:pPr>
+              <w:spacing w:before="20" w:after="40"/>
+              <w:jc w:val="left"/>
+            </w:pPr>
+            <w:r>
+              <w:rPr>
+                <w:sz w:val="21"/>
+              </w:rPr>
+              <w:t xml:space="preserve">    4.8 Research Hypothesis</w:t>
+            </w:r>
+          </w:p>
+        </w:tc>
+        <w:tc>
+          <w:tcPr>
+            <w:tcW w:type="dxa" w:w="1440"/>
+            <w:tcBorders>
+              <w:top w:val="none"/>
+              <w:left w:val="none"/>
+              <w:bottom w:val="none"/>
+              <w:right w:val="none"/>
+            </w:tcBorders>
+          </w:tcPr>
+          <w:p>
+            <w:pPr>
+              <w:spacing w:before="20" w:after="40"/>
+              <w:jc w:val="right"/>
+            </w:pPr>
+            <w:r>
+              <w:rPr>
+                <w:sz w:val="21"/>
+              </w:rPr>
+              <w:t>6</w:t>
+            </w:r>
+          </w:p>
+        </w:tc>
+      </w:tr>
+      <w:tr>
+        <w:tc>
+          <w:tcPr>
+            <w:tcW w:type="dxa" w:w="7920"/>
+            <w:tcBorders>
+              <w:top w:val="none"/>
+              <w:left w:val="none"/>
+              <w:bottom w:val="none"/>
+              <w:right w:val="none"/>
+            </w:tcBorders>
+          </w:tcPr>
+          <w:p>
+            <w:pPr>
+              <w:spacing w:before="20" w:after="40"/>
+              <w:jc w:val="left"/>
+            </w:pPr>
+            <w:r>
+              <w:rPr>
+                <w:sz w:val="21"/>
+              </w:rPr>
+              <w:t xml:space="preserve">    4.9 Scope of the Project</w:t>
+            </w:r>
+          </w:p>
+        </w:tc>
+        <w:tc>
+          <w:tcPr>
+            <w:tcW w:type="dxa" w:w="1440"/>
+            <w:tcBorders>
+              <w:top w:val="none"/>
+              <w:left w:val="none"/>
+              <w:bottom w:val="none"/>
+              <w:right w:val="none"/>
+            </w:tcBorders>
+          </w:tcPr>
+          <w:p>
+            <w:pPr>
+              <w:spacing w:before="20" w:after="40"/>
+              <w:jc w:val="right"/>
+            </w:pPr>
+            <w:r>
+              <w:rPr>
+                <w:sz w:val="21"/>
+              </w:rPr>
+              <w:t>7</w:t>
+            </w:r>
+          </w:p>
+        </w:tc>
+      </w:tr>
+      <w:tr>
+        <w:tc>
+          <w:tcPr>
+            <w:tcW w:type="dxa" w:w="7920"/>
+            <w:tcBorders>
+              <w:top w:val="none"/>
+              <w:left w:val="none"/>
+              <w:bottom w:val="none"/>
+              <w:right w:val="none"/>
+            </w:tcBorders>
+          </w:tcPr>
+          <w:p>
+            <w:pPr>
+              <w:spacing w:before="20" w:after="40"/>
+              <w:jc w:val="left"/>
+            </w:pPr>
+            <w:r>
+              <w:rPr>
+                <w:sz w:val="21"/>
+              </w:rPr>
+              <w:t xml:space="preserve">    4.10 Novelty and Contribution of the Project</w:t>
+            </w:r>
+          </w:p>
+        </w:tc>
+        <w:tc>
+          <w:tcPr>
+            <w:tcW w:type="dxa" w:w="1440"/>
+            <w:tcBorders>
+              <w:top w:val="none"/>
+              <w:left w:val="none"/>
+              <w:bottom w:val="none"/>
+              <w:right w:val="none"/>
+            </w:tcBorders>
+          </w:tcPr>
+          <w:p>
+            <w:pPr>
+              <w:spacing w:before="20" w:after="40"/>
+              <w:jc w:val="right"/>
+            </w:pPr>
+            <w:r>
+              <w:rPr>
+                <w:sz w:val="21"/>
+              </w:rPr>
+              <w:t>7</w:t>
+            </w:r>
+          </w:p>
+        </w:tc>
+      </w:tr>
+      <w:tr>
+        <w:tc>
+          <w:tcPr>
+            <w:tcW w:type="dxa" w:w="7920"/>
+            <w:tcBorders>
+              <w:top w:val="none"/>
+              <w:left w:val="none"/>
+              <w:bottom w:val="none"/>
+              <w:right w:val="none"/>
+            </w:tcBorders>
+          </w:tcPr>
+          <w:p>
+            <w:pPr>
+              <w:spacing w:before="20" w:after="40"/>
+              <w:jc w:val="left"/>
+            </w:pPr>
+            <w:r>
+              <w:rPr>
+                <w:sz w:val="21"/>
+              </w:rPr>
+              <w:t xml:space="preserve">    4.11 Organization of the Report</w:t>
+            </w:r>
+          </w:p>
+        </w:tc>
+        <w:tc>
+          <w:tcPr>
+            <w:tcW w:type="dxa" w:w="1440"/>
+            <w:tcBorders>
+              <w:top w:val="none"/>
+              <w:left w:val="none"/>
+              <w:bottom w:val="none"/>
+              <w:right w:val="none"/>
+            </w:tcBorders>
+          </w:tcPr>
+          <w:p>
+            <w:pPr>
+              <w:spacing w:before="20" w:after="40"/>
+              <w:jc w:val="right"/>
+            </w:pPr>
+            <w:r>
+              <w:rPr>
+                <w:sz w:val="21"/>
+              </w:rPr>
+              <w:t>7</w:t>
+            </w:r>
+          </w:p>
+        </w:tc>
+      </w:tr>
+      <w:tr>
+        <w:tc>
+          <w:tcPr>
+            <w:tcW w:type="dxa" w:w="7920"/>
+            <w:tcBorders>
+              <w:top w:val="none"/>
+              <w:left w:val="none"/>
+              <w:bottom w:val="none"/>
+              <w:right w:val="none"/>
+            </w:tcBorders>
+          </w:tcPr>
+          <w:p>
+            <w:pPr>
+              <w:spacing w:before="20" w:after="40"/>
+              <w:jc w:val="left"/>
+            </w:pPr>
+            <w:r>
+              <w:rPr>
+                <w:sz w:val="21"/>
+              </w:rPr>
+              <w:t xml:space="preserve">    4.12 Expected Research Outcome</w:t>
+            </w:r>
+          </w:p>
+        </w:tc>
+        <w:tc>
+          <w:tcPr>
+            <w:tcW w:type="dxa" w:w="1440"/>
+            <w:tcBorders>
+              <w:top w:val="none"/>
+              <w:left w:val="none"/>
+              <w:bottom w:val="none"/>
+              <w:right w:val="none"/>
+            </w:tcBorders>
+          </w:tcPr>
+          <w:p>
+            <w:pPr>
+              <w:spacing w:before="20" w:after="40"/>
+              <w:jc w:val="right"/>
+            </w:pPr>
+            <w:r>
+              <w:rPr>
+                <w:sz w:val="21"/>
+              </w:rPr>
+              <w:t>8</w:t>
+            </w:r>
+          </w:p>
+        </w:tc>
+      </w:tr>
+      <w:tr>
+        <w:tc>
+          <w:tcPr>
+            <w:tcW w:type="dxa" w:w="7920"/>
+            <w:tcBorders>
+              <w:top w:val="none"/>
+              <w:left w:val="none"/>
+              <w:bottom w:val="none"/>
+              <w:right w:val="none"/>
+            </w:tcBorders>
+          </w:tcPr>
+          <w:p>
+            <w:pPr>
+              <w:spacing w:before="20" w:after="40"/>
+              <w:jc w:val="left"/>
+            </w:pPr>
+            <w:r>
+              <w:rPr>
+                <w:b/>
+                <w:sz w:val="21"/>
+              </w:rPr>
+              <w:t>5. Literature Review / Related Work</w:t>
+            </w:r>
+          </w:p>
+        </w:tc>
+        <w:tc>
+          <w:tcPr>
+            <w:tcW w:type="dxa" w:w="1440"/>
+            <w:tcBorders>
+              <w:top w:val="none"/>
+              <w:left w:val="none"/>
+              <w:bottom w:val="none"/>
+              <w:right w:val="none"/>
+            </w:tcBorders>
+          </w:tcPr>
+          <w:p>
+            <w:pPr>
+              <w:spacing w:before="20" w:after="40"/>
+              <w:jc w:val="right"/>
+            </w:pPr>
+            <w:r>
+              <w:rPr>
+                <w:b/>
+                <w:sz w:val="21"/>
+              </w:rPr>
+              <w:t>9</w:t>
+            </w:r>
+          </w:p>
+        </w:tc>
+      </w:tr>
+      <w:tr>
+        <w:tc>
+          <w:tcPr>
+            <w:tcW w:type="dxa" w:w="7920"/>
+            <w:tcBorders>
+              <w:top w:val="none"/>
+              <w:left w:val="none"/>
+              <w:bottom w:val="none"/>
+              <w:right w:val="none"/>
+            </w:tcBorders>
+          </w:tcPr>
+          <w:p>
+            <w:pPr>
+              <w:spacing w:before="20" w:after="40"/>
+              <w:jc w:val="left"/>
+            </w:pPr>
+            <w:r>
+              <w:rPr>
+                <w:sz w:val="21"/>
+              </w:rPr>
+              <w:t xml:space="preserve">    5.1 Traditional Approaches to Battery SoH Estimation</w:t>
+            </w:r>
+          </w:p>
+        </w:tc>
+        <w:tc>
+          <w:tcPr>
+            <w:tcW w:type="dxa" w:w="1440"/>
+            <w:tcBorders>
+              <w:top w:val="none"/>
+              <w:left w:val="none"/>
+              <w:bottom w:val="none"/>
+              <w:right w:val="none"/>
+            </w:tcBorders>
+          </w:tcPr>
+          <w:p>
+            <w:pPr>
+              <w:spacing w:before="20" w:after="40"/>
+              <w:jc w:val="right"/>
+            </w:pPr>
+            <w:r>
+              <w:rPr>
+                <w:sz w:val="21"/>
+              </w:rPr>
+              <w:t>9</w:t>
+            </w:r>
+          </w:p>
+        </w:tc>
+      </w:tr>
+      <w:tr>
+        <w:tc>
+          <w:tcPr>
+            <w:tcW w:type="dxa" w:w="7920"/>
+            <w:tcBorders>
+              <w:top w:val="none"/>
+              <w:left w:val="none"/>
+              <w:bottom w:val="none"/>
+              <w:right w:val="none"/>
+            </w:tcBorders>
+          </w:tcPr>
+          <w:p>
+            <w:pPr>
+              <w:spacing w:before="20" w:after="40"/>
+              <w:jc w:val="left"/>
+            </w:pPr>
+            <w:r>
+              <w:rPr>
+                <w:sz w:val="21"/>
+              </w:rPr>
+              <w:t xml:space="preserve">    5.2 Machine Learning-Based SoH Estimation</w:t>
+            </w:r>
+          </w:p>
+        </w:tc>
+        <w:tc>
+          <w:tcPr>
+            <w:tcW w:type="dxa" w:w="1440"/>
+            <w:tcBorders>
+              <w:top w:val="none"/>
+              <w:left w:val="none"/>
+              <w:bottom w:val="none"/>
+              <w:right w:val="none"/>
+            </w:tcBorders>
+          </w:tcPr>
+          <w:p>
+            <w:pPr>
+              <w:spacing w:before="20" w:after="40"/>
+              <w:jc w:val="right"/>
+            </w:pPr>
+            <w:r>
+              <w:rPr>
+                <w:sz w:val="21"/>
+              </w:rPr>
+              <w:t>9</w:t>
+            </w:r>
+          </w:p>
+        </w:tc>
+      </w:tr>
+      <w:tr>
+        <w:tc>
+          <w:tcPr>
+            <w:tcW w:type="dxa" w:w="7920"/>
+            <w:tcBorders>
+              <w:top w:val="none"/>
+              <w:left w:val="none"/>
+              <w:bottom w:val="none"/>
+              <w:right w:val="none"/>
+            </w:tcBorders>
+          </w:tcPr>
+          <w:p>
+            <w:pPr>
+              <w:spacing w:before="20" w:after="40"/>
+              <w:jc w:val="left"/>
+            </w:pPr>
+            <w:r>
+              <w:rPr>
+                <w:sz w:val="21"/>
+              </w:rPr>
+              <w:t xml:space="preserve">    5.3 Feature Engineering for SoH Estimation</w:t>
+            </w:r>
+          </w:p>
+        </w:tc>
+        <w:tc>
+          <w:tcPr>
+            <w:tcW w:type="dxa" w:w="1440"/>
+            <w:tcBorders>
+              <w:top w:val="none"/>
+              <w:left w:val="none"/>
+              <w:bottom w:val="none"/>
+              <w:right w:val="none"/>
+            </w:tcBorders>
+          </w:tcPr>
+          <w:p>
+            <w:pPr>
+              <w:spacing w:before="20" w:after="40"/>
+              <w:jc w:val="right"/>
+            </w:pPr>
+            <w:r>
+              <w:rPr>
+                <w:sz w:val="21"/>
+              </w:rPr>
+              <w:t>9</w:t>
+            </w:r>
+          </w:p>
+        </w:tc>
+      </w:tr>
+      <w:tr>
+        <w:tc>
+          <w:tcPr>
+            <w:tcW w:type="dxa" w:w="7920"/>
+            <w:tcBorders>
+              <w:top w:val="none"/>
+              <w:left w:val="none"/>
+              <w:bottom w:val="none"/>
+              <w:right w:val="none"/>
+            </w:tcBorders>
+          </w:tcPr>
+          <w:p>
+            <w:pPr>
+              <w:spacing w:before="20" w:after="40"/>
+              <w:jc w:val="left"/>
+            </w:pPr>
+            <w:r>
+              <w:rPr>
+                <w:sz w:val="21"/>
+              </w:rPr>
+              <w:t xml:space="preserve">    5.4 Deep Learning for Battery SoH Estimation</w:t>
+            </w:r>
+          </w:p>
+        </w:tc>
+        <w:tc>
+          <w:tcPr>
+            <w:tcW w:type="dxa" w:w="1440"/>
+            <w:tcBorders>
+              <w:top w:val="none"/>
+              <w:left w:val="none"/>
+              <w:bottom w:val="none"/>
+              <w:right w:val="none"/>
+            </w:tcBorders>
+          </w:tcPr>
+          <w:p>
+            <w:pPr>
+              <w:spacing w:before="20" w:after="40"/>
+              <w:jc w:val="right"/>
+            </w:pPr>
+            <w:r>
+              <w:rPr>
+                <w:sz w:val="21"/>
+              </w:rPr>
+              <w:t>10</w:t>
+            </w:r>
+          </w:p>
+        </w:tc>
+      </w:tr>
+      <w:tr>
+        <w:tc>
+          <w:tcPr>
+            <w:tcW w:type="dxa" w:w="7920"/>
+            <w:tcBorders>
+              <w:top w:val="none"/>
+              <w:left w:val="none"/>
+              <w:bottom w:val="none"/>
+              <w:right w:val="none"/>
+            </w:tcBorders>
+          </w:tcPr>
+          <w:p>
+            <w:pPr>
+              <w:spacing w:before="20" w:after="40"/>
+              <w:jc w:val="left"/>
+            </w:pPr>
+            <w:r>
+              <w:rPr>
+                <w:sz w:val="21"/>
+              </w:rPr>
+              <w:t xml:space="preserve">    5.5 Explainable Artificial Intelligence</w:t>
+            </w:r>
+          </w:p>
+        </w:tc>
+        <w:tc>
+          <w:tcPr>
+            <w:tcW w:type="dxa" w:w="1440"/>
+            <w:tcBorders>
+              <w:top w:val="none"/>
+              <w:left w:val="none"/>
+              <w:bottom w:val="none"/>
+              <w:right w:val="none"/>
+            </w:tcBorders>
+          </w:tcPr>
+          <w:p>
+            <w:pPr>
+              <w:spacing w:before="20" w:after="40"/>
+              <w:jc w:val="right"/>
+            </w:pPr>
+            <w:r>
+              <w:rPr>
+                <w:sz w:val="21"/>
+              </w:rPr>
+              <w:t>10</w:t>
+            </w:r>
+          </w:p>
+        </w:tc>
+      </w:tr>
+      <w:tr>
+        <w:tc>
+          <w:tcPr>
+            <w:tcW w:type="dxa" w:w="7920"/>
+            <w:tcBorders>
+              <w:top w:val="none"/>
+              <w:left w:val="none"/>
+              <w:bottom w:val="none"/>
+              <w:right w:val="none"/>
+            </w:tcBorders>
+          </w:tcPr>
+          <w:p>
+            <w:pPr>
+              <w:spacing w:before="20" w:after="40"/>
+              <w:jc w:val="left"/>
+            </w:pPr>
+            <w:r>
+              <w:rPr>
+                <w:sz w:val="21"/>
+              </w:rPr>
+              <w:t xml:space="preserve">    5.6 Recent Explainable ML Research</w:t>
+            </w:r>
+          </w:p>
+        </w:tc>
+        <w:tc>
+          <w:tcPr>
+            <w:tcW w:type="dxa" w:w="1440"/>
+            <w:tcBorders>
+              <w:top w:val="none"/>
+              <w:left w:val="none"/>
+              <w:bottom w:val="none"/>
+              <w:right w:val="none"/>
+            </w:tcBorders>
+          </w:tcPr>
+          <w:p>
+            <w:pPr>
+              <w:spacing w:before="20" w:after="40"/>
+              <w:jc w:val="right"/>
+            </w:pPr>
+            <w:r>
+              <w:rPr>
+                <w:sz w:val="21"/>
+              </w:rPr>
+              <w:t>10</w:t>
+            </w:r>
+          </w:p>
+        </w:tc>
+      </w:tr>
+      <w:tr>
+        <w:tc>
+          <w:tcPr>
+            <w:tcW w:type="dxa" w:w="7920"/>
+            <w:tcBorders>
+              <w:top w:val="none"/>
+              <w:left w:val="none"/>
+              <w:bottom w:val="none"/>
+              <w:right w:val="none"/>
+            </w:tcBorders>
+          </w:tcPr>
+          <w:p>
+            <w:pPr>
+              <w:spacing w:before="20" w:after="40"/>
+              <w:jc w:val="left"/>
+            </w:pPr>
+            <w:r>
+              <w:rPr>
+                <w:sz w:val="21"/>
+              </w:rPr>
+              <w:t xml:space="preserve">    5.7 Randomized Battery Usage in Existing Research</w:t>
+            </w:r>
+          </w:p>
+        </w:tc>
+        <w:tc>
+          <w:tcPr>
+            <w:tcW w:type="dxa" w:w="1440"/>
+            <w:tcBorders>
+              <w:top w:val="none"/>
+              <w:left w:val="none"/>
+              <w:bottom w:val="none"/>
+              <w:right w:val="none"/>
+            </w:tcBorders>
+          </w:tcPr>
+          <w:p>
+            <w:pPr>
+              <w:spacing w:before="20" w:after="40"/>
+              <w:jc w:val="right"/>
+            </w:pPr>
+            <w:r>
+              <w:rPr>
+                <w:sz w:val="21"/>
+              </w:rPr>
+              <w:t>10</w:t>
+            </w:r>
+          </w:p>
+        </w:tc>
+      </w:tr>
+      <w:tr>
+        <w:tc>
+          <w:tcPr>
+            <w:tcW w:type="dxa" w:w="7920"/>
+            <w:tcBorders>
+              <w:top w:val="none"/>
+              <w:left w:val="none"/>
+              <w:bottom w:val="none"/>
+              <w:right w:val="none"/>
+            </w:tcBorders>
+          </w:tcPr>
+          <w:p>
+            <w:pPr>
+              <w:spacing w:before="20" w:after="40"/>
+              <w:jc w:val="left"/>
+            </w:pPr>
+            <w:r>
+              <w:rPr>
+                <w:sz w:val="21"/>
+              </w:rPr>
+              <w:t xml:space="preserve">    5.8 Comparison of Existing Research</w:t>
+            </w:r>
+          </w:p>
+        </w:tc>
+        <w:tc>
+          <w:tcPr>
+            <w:tcW w:type="dxa" w:w="1440"/>
+            <w:tcBorders>
+              <w:top w:val="none"/>
+              <w:left w:val="none"/>
+              <w:bottom w:val="none"/>
+              <w:right w:val="none"/>
+            </w:tcBorders>
+          </w:tcPr>
+          <w:p>
+            <w:pPr>
+              <w:spacing w:before="20" w:after="40"/>
+              <w:jc w:val="right"/>
+            </w:pPr>
+            <w:r>
+              <w:rPr>
+                <w:sz w:val="21"/>
+              </w:rPr>
+              <w:t>11</w:t>
+            </w:r>
+          </w:p>
+        </w:tc>
+      </w:tr>
+      <w:tr>
+        <w:tc>
+          <w:tcPr>
+            <w:tcW w:type="dxa" w:w="7920"/>
+            <w:tcBorders>
+              <w:top w:val="none"/>
+              <w:left w:val="none"/>
+              <w:bottom w:val="none"/>
+              <w:right w:val="none"/>
+            </w:tcBorders>
+          </w:tcPr>
+          <w:p>
+            <w:pPr>
+              <w:spacing w:before="20" w:after="40"/>
+              <w:jc w:val="left"/>
+            </w:pPr>
+            <w:r>
+              <w:rPr>
+                <w:sz w:val="21"/>
+              </w:rPr>
+              <w:t xml:space="preserve">    5.9 Discussion of Existing Work</w:t>
+            </w:r>
+          </w:p>
+        </w:tc>
+        <w:tc>
+          <w:tcPr>
+            <w:tcW w:type="dxa" w:w="1440"/>
+            <w:tcBorders>
+              <w:top w:val="none"/>
+              <w:left w:val="none"/>
+              <w:bottom w:val="none"/>
+              <w:right w:val="none"/>
+            </w:tcBorders>
+          </w:tcPr>
+          <w:p>
+            <w:pPr>
+              <w:spacing w:before="20" w:after="40"/>
+              <w:jc w:val="right"/>
+            </w:pPr>
+            <w:r>
+              <w:rPr>
+                <w:sz w:val="21"/>
+              </w:rPr>
+              <w:t>11</w:t>
+            </w:r>
+          </w:p>
+        </w:tc>
+      </w:tr>
+      <w:tr>
+        <w:tc>
+          <w:tcPr>
+            <w:tcW w:type="dxa" w:w="7920"/>
+            <w:tcBorders>
+              <w:top w:val="none"/>
+              <w:left w:val="none"/>
+              <w:bottom w:val="none"/>
+              <w:right w:val="none"/>
+            </w:tcBorders>
+          </w:tcPr>
+          <w:p>
+            <w:pPr>
+              <w:spacing w:before="20" w:after="40"/>
+              <w:jc w:val="left"/>
+            </w:pPr>
+            <w:r>
+              <w:rPr>
+                <w:sz w:val="21"/>
+              </w:rPr>
+              <w:t xml:space="preserve">    5.10 Limitations Identified in Existing Research</w:t>
+            </w:r>
+          </w:p>
+        </w:tc>
+        <w:tc>
+          <w:tcPr>
+            <w:tcW w:type="dxa" w:w="1440"/>
+            <w:tcBorders>
+              <w:top w:val="none"/>
+              <w:left w:val="none"/>
+              <w:bottom w:val="none"/>
+              <w:right w:val="none"/>
+            </w:tcBorders>
+          </w:tcPr>
+          <w:p>
+            <w:pPr>
+              <w:spacing w:before="20" w:after="40"/>
+              <w:jc w:val="right"/>
+            </w:pPr>
+            <w:r>
+              <w:rPr>
+                <w:sz w:val="21"/>
+              </w:rPr>
+              <w:t>12</w:t>
+            </w:r>
+          </w:p>
+        </w:tc>
+      </w:tr>
+      <w:tr>
+        <w:tc>
+          <w:tcPr>
+            <w:tcW w:type="dxa" w:w="7920"/>
+            <w:tcBorders>
+              <w:top w:val="none"/>
+              <w:left w:val="none"/>
+              <w:bottom w:val="none"/>
+              <w:right w:val="none"/>
+            </w:tcBorders>
+          </w:tcPr>
+          <w:p>
+            <w:pPr>
+              <w:spacing w:before="20" w:after="40"/>
+              <w:jc w:val="left"/>
+            </w:pPr>
+            <w:r>
+              <w:rPr>
+                <w:sz w:val="21"/>
+              </w:rPr>
+              <w:t xml:space="preserve">    5.11 Research Gap</w:t>
+            </w:r>
+          </w:p>
+        </w:tc>
+        <w:tc>
+          <w:tcPr>
+            <w:tcW w:type="dxa" w:w="1440"/>
+            <w:tcBorders>
+              <w:top w:val="none"/>
+              <w:left w:val="none"/>
+              <w:bottom w:val="none"/>
+              <w:right w:val="none"/>
+            </w:tcBorders>
+          </w:tcPr>
+          <w:p>
+            <w:pPr>
+              <w:spacing w:before="20" w:after="40"/>
+              <w:jc w:val="right"/>
+            </w:pPr>
+            <w:r>
+              <w:rPr>
+                <w:sz w:val="21"/>
+              </w:rPr>
+              <w:t>12</w:t>
+            </w:r>
+          </w:p>
+        </w:tc>
+      </w:tr>
+      <w:tr>
+        <w:tc>
+          <w:tcPr>
+            <w:tcW w:type="dxa" w:w="7920"/>
+            <w:tcBorders>
+              <w:top w:val="none"/>
+              <w:left w:val="none"/>
+              <w:bottom w:val="none"/>
+              <w:right w:val="none"/>
+            </w:tcBorders>
+          </w:tcPr>
+          <w:p>
+            <w:pPr>
+              <w:spacing w:before="20" w:after="40"/>
+              <w:jc w:val="left"/>
+            </w:pPr>
+            <w:r>
+              <w:rPr>
+                <w:sz w:val="21"/>
+              </w:rPr>
+              <w:t xml:space="preserve">    5.12 Research Gap Addressed by the Present Project</w:t>
+            </w:r>
+          </w:p>
+        </w:tc>
+        <w:tc>
+          <w:tcPr>
+            <w:tcW w:type="dxa" w:w="1440"/>
+            <w:tcBorders>
+              <w:top w:val="none"/>
+              <w:left w:val="none"/>
+              <w:bottom w:val="none"/>
+              <w:right w:val="none"/>
+            </w:tcBorders>
+          </w:tcPr>
+          <w:p>
+            <w:pPr>
+              <w:spacing w:before="20" w:after="40"/>
+              <w:jc w:val="right"/>
+            </w:pPr>
+            <w:r>
+              <w:rPr>
+                <w:sz w:val="21"/>
+              </w:rPr>
+              <w:t>12</w:t>
+            </w:r>
+          </w:p>
+        </w:tc>
+      </w:tr>
+      <w:tr>
+        <w:tc>
+          <w:tcPr>
+            <w:tcW w:type="dxa" w:w="7920"/>
+            <w:tcBorders>
+              <w:top w:val="none"/>
+              <w:left w:val="none"/>
+              <w:bottom w:val="none"/>
+              <w:right w:val="none"/>
+            </w:tcBorders>
+          </w:tcPr>
+          <w:p>
+            <w:pPr>
+              <w:spacing w:before="20" w:after="40"/>
+              <w:jc w:val="left"/>
+            </w:pPr>
+            <w:r>
+              <w:rPr>
+                <w:sz w:val="21"/>
+              </w:rPr>
+              <w:t xml:space="preserve">    5.13 Positioning of the Present Work</w:t>
+            </w:r>
+          </w:p>
+        </w:tc>
+        <w:tc>
+          <w:tcPr>
+            <w:tcW w:type="dxa" w:w="1440"/>
+            <w:tcBorders>
+              <w:top w:val="none"/>
+              <w:left w:val="none"/>
+              <w:bottom w:val="none"/>
+              <w:right w:val="none"/>
+            </w:tcBorders>
+          </w:tcPr>
+          <w:p>
+            <w:pPr>
+              <w:spacing w:before="20" w:after="40"/>
+              <w:jc w:val="right"/>
+            </w:pPr>
+            <w:r>
+              <w:rPr>
+                <w:sz w:val="21"/>
+              </w:rPr>
+              <w:t>13</w:t>
+            </w:r>
+          </w:p>
+        </w:tc>
+      </w:tr>
+      <w:tr>
+        <w:tc>
+          <w:tcPr>
+            <w:tcW w:type="dxa" w:w="7920"/>
+            <w:tcBorders>
+              <w:top w:val="none"/>
+              <w:left w:val="none"/>
+              <w:bottom w:val="none"/>
+              <w:right w:val="none"/>
+            </w:tcBorders>
+          </w:tcPr>
+          <w:p>
+            <w:pPr>
+              <w:spacing w:before="20" w:after="40"/>
+              <w:jc w:val="left"/>
+            </w:pPr>
+            <w:r>
+              <w:rPr>
+                <w:sz w:val="21"/>
+              </w:rPr>
+              <w:t xml:space="preserve">    5.14 Summary of Literature Review</w:t>
+            </w:r>
+          </w:p>
+        </w:tc>
+        <w:tc>
+          <w:tcPr>
+            <w:tcW w:type="dxa" w:w="1440"/>
+            <w:tcBorders>
+              <w:top w:val="none"/>
+              <w:left w:val="none"/>
+              <w:bottom w:val="none"/>
+              <w:right w:val="none"/>
+            </w:tcBorders>
+          </w:tcPr>
+          <w:p>
+            <w:pPr>
+              <w:spacing w:before="20" w:after="40"/>
+              <w:jc w:val="right"/>
+            </w:pPr>
+            <w:r>
+              <w:rPr>
+                <w:sz w:val="21"/>
+              </w:rPr>
+              <w:t>13</w:t>
+            </w:r>
+          </w:p>
+        </w:tc>
+      </w:tr>
+      <w:tr>
+        <w:tc>
+          <w:tcPr>
+            <w:tcW w:type="dxa" w:w="7920"/>
+            <w:tcBorders>
+              <w:top w:val="none"/>
+              <w:left w:val="none"/>
+              <w:bottom w:val="none"/>
+              <w:right w:val="none"/>
+            </w:tcBorders>
+          </w:tcPr>
+          <w:p>
+            <w:pPr>
+              <w:spacing w:before="20" w:after="40"/>
+              <w:jc w:val="left"/>
+            </w:pPr>
+            <w:r>
+              <w:rPr>
+                <w:b/>
+                <w:sz w:val="21"/>
+              </w:rPr>
+              <w:t>6. Methodology / Proposed System</w:t>
+            </w:r>
+          </w:p>
+        </w:tc>
+        <w:tc>
+          <w:tcPr>
+            <w:tcW w:type="dxa" w:w="1440"/>
+            <w:tcBorders>
+              <w:top w:val="none"/>
+              <w:left w:val="none"/>
+              <w:bottom w:val="none"/>
+              <w:right w:val="none"/>
+            </w:tcBorders>
+          </w:tcPr>
+          <w:p>
+            <w:pPr>
+              <w:spacing w:before="20" w:after="40"/>
+              <w:jc w:val="right"/>
+            </w:pPr>
+            <w:r>
+              <w:rPr>
+                <w:b/>
+                <w:sz w:val="21"/>
+              </w:rPr>
+              <w:t>14</w:t>
+            </w:r>
+          </w:p>
+        </w:tc>
+      </w:tr>
+      <w:tr>
+        <w:tc>
+          <w:tcPr>
+            <w:tcW w:type="dxa" w:w="7920"/>
+            <w:tcBorders>
+              <w:top w:val="none"/>
+              <w:left w:val="none"/>
+              <w:bottom w:val="none"/>
+              <w:right w:val="none"/>
+            </w:tcBorders>
+          </w:tcPr>
+          <w:p>
+            <w:pPr>
+              <w:spacing w:before="20" w:after="40"/>
+              <w:jc w:val="left"/>
+            </w:pPr>
+            <w:r>
+              <w:rPr>
+                <w:sz w:val="21"/>
+              </w:rPr>
+              <w:t xml:space="preserve">    6.1 Proposed Methodology</w:t>
+            </w:r>
+          </w:p>
+        </w:tc>
+        <w:tc>
+          <w:tcPr>
+            <w:tcW w:type="dxa" w:w="1440"/>
+            <w:tcBorders>
+              <w:top w:val="none"/>
+              <w:left w:val="none"/>
+              <w:bottom w:val="none"/>
+              <w:right w:val="none"/>
+            </w:tcBorders>
+          </w:tcPr>
+          <w:p>
+            <w:pPr>
+              <w:spacing w:before="20" w:after="40"/>
+              <w:jc w:val="right"/>
+            </w:pPr>
+            <w:r>
+              <w:rPr>
+                <w:sz w:val="21"/>
+              </w:rPr>
+              <w:t>14</w:t>
+            </w:r>
+          </w:p>
+        </w:tc>
+      </w:tr>
+      <w:tr>
+        <w:tc>
+          <w:tcPr>
+            <w:tcW w:type="dxa" w:w="7920"/>
+            <w:tcBorders>
+              <w:top w:val="none"/>
+              <w:left w:val="none"/>
+              <w:bottom w:val="none"/>
+              <w:right w:val="none"/>
+            </w:tcBorders>
+          </w:tcPr>
+          <w:p>
+            <w:pPr>
+              <w:spacing w:before="20" w:after="40"/>
+              <w:jc w:val="left"/>
+            </w:pPr>
+            <w:r>
+              <w:rPr>
+                <w:sz w:val="21"/>
+              </w:rPr>
+              <w:t xml:space="preserve">    6.2 Data Collection and Preparation</w:t>
+            </w:r>
+          </w:p>
+        </w:tc>
+        <w:tc>
+          <w:tcPr>
+            <w:tcW w:type="dxa" w:w="1440"/>
+            <w:tcBorders>
+              <w:top w:val="none"/>
+              <w:left w:val="none"/>
+              <w:bottom w:val="none"/>
+              <w:right w:val="none"/>
+            </w:tcBorders>
+          </w:tcPr>
+          <w:p>
+            <w:pPr>
+              <w:spacing w:before="20" w:after="40"/>
+              <w:jc w:val="right"/>
+            </w:pPr>
+            <w:r>
+              <w:rPr>
+                <w:sz w:val="21"/>
+              </w:rPr>
+              <w:t>14</w:t>
+            </w:r>
+          </w:p>
+        </w:tc>
+      </w:tr>
+      <w:tr>
+        <w:tc>
+          <w:tcPr>
+            <w:tcW w:type="dxa" w:w="7920"/>
+            <w:tcBorders>
+              <w:top w:val="none"/>
+              <w:left w:val="none"/>
+              <w:bottom w:val="none"/>
+              <w:right w:val="none"/>
+            </w:tcBorders>
+          </w:tcPr>
+          <w:p>
+            <w:pPr>
+              <w:spacing w:before="20" w:after="40"/>
+              <w:jc w:val="left"/>
+            </w:pPr>
+            <w:r>
+              <w:rPr>
+                <w:sz w:val="21"/>
+              </w:rPr>
+              <w:t xml:space="preserve">    6.3 State of Health Calculation</w:t>
+            </w:r>
+          </w:p>
+        </w:tc>
+        <w:tc>
+          <w:tcPr>
+            <w:tcW w:type="dxa" w:w="1440"/>
+            <w:tcBorders>
+              <w:top w:val="none"/>
+              <w:left w:val="none"/>
+              <w:bottom w:val="none"/>
+              <w:right w:val="none"/>
+            </w:tcBorders>
+          </w:tcPr>
+          <w:p>
+            <w:pPr>
+              <w:spacing w:before="20" w:after="40"/>
+              <w:jc w:val="right"/>
+            </w:pPr>
+            <w:r>
+              <w:rPr>
+                <w:sz w:val="21"/>
+              </w:rPr>
+              <w:t>15</w:t>
+            </w:r>
+          </w:p>
+        </w:tc>
+      </w:tr>
+      <w:tr>
+        <w:tc>
+          <w:tcPr>
+            <w:tcW w:type="dxa" w:w="7920"/>
+            <w:tcBorders>
+              <w:top w:val="none"/>
+              <w:left w:val="none"/>
+              <w:bottom w:val="none"/>
+              <w:right w:val="none"/>
+            </w:tcBorders>
+          </w:tcPr>
+          <w:p>
+            <w:pPr>
+              <w:spacing w:before="20" w:after="40"/>
+              <w:jc w:val="left"/>
+            </w:pPr>
+            <w:r>
+              <w:rPr>
+                <w:sz w:val="21"/>
+              </w:rPr>
+              <w:t xml:space="preserve">    6.4 Feature Engineering</w:t>
+            </w:r>
+          </w:p>
+        </w:tc>
+        <w:tc>
+          <w:tcPr>
+            <w:tcW w:type="dxa" w:w="1440"/>
+            <w:tcBorders>
+              <w:top w:val="none"/>
+              <w:left w:val="none"/>
+              <w:bottom w:val="none"/>
+              <w:right w:val="none"/>
+            </w:tcBorders>
+          </w:tcPr>
+          <w:p>
+            <w:pPr>
+              <w:spacing w:before="20" w:after="40"/>
+              <w:jc w:val="right"/>
+            </w:pPr>
+            <w:r>
+              <w:rPr>
+                <w:sz w:val="21"/>
+              </w:rPr>
+              <w:t>15</w:t>
+            </w:r>
+          </w:p>
+        </w:tc>
+      </w:tr>
+      <w:tr>
+        <w:tc>
+          <w:tcPr>
+            <w:tcW w:type="dxa" w:w="7920"/>
+            <w:tcBorders>
+              <w:top w:val="none"/>
+              <w:left w:val="none"/>
+              <w:bottom w:val="none"/>
+              <w:right w:val="none"/>
+            </w:tcBorders>
+          </w:tcPr>
+          <w:p>
+            <w:pPr>
+              <w:spacing w:before="20" w:after="40"/>
+              <w:jc w:val="left"/>
+            </w:pPr>
+            <w:r>
+              <w:rPr>
+                <w:sz w:val="21"/>
+              </w:rPr>
+              <w:t xml:space="preserve">    6.5 Data Cleaning and Preprocessing</w:t>
+            </w:r>
+          </w:p>
+        </w:tc>
+        <w:tc>
+          <w:tcPr>
+            <w:tcW w:type="dxa" w:w="1440"/>
+            <w:tcBorders>
+              <w:top w:val="none"/>
+              <w:left w:val="none"/>
+              <w:bottom w:val="none"/>
+              <w:right w:val="none"/>
+            </w:tcBorders>
+          </w:tcPr>
+          <w:p>
+            <w:pPr>
+              <w:spacing w:before="20" w:after="40"/>
+              <w:jc w:val="right"/>
+            </w:pPr>
+            <w:r>
+              <w:rPr>
+                <w:sz w:val="21"/>
+              </w:rPr>
+              <w:t>15</w:t>
+            </w:r>
+          </w:p>
+        </w:tc>
+      </w:tr>
+      <w:tr>
+        <w:tc>
+          <w:tcPr>
+            <w:tcW w:type="dxa" w:w="7920"/>
+            <w:tcBorders>
+              <w:top w:val="none"/>
+              <w:left w:val="none"/>
+              <w:bottom w:val="none"/>
+              <w:right w:val="none"/>
+            </w:tcBorders>
+          </w:tcPr>
+          <w:p>
+            <w:pPr>
+              <w:spacing w:before="20" w:after="40"/>
+              <w:jc w:val="left"/>
+            </w:pPr>
+            <w:r>
+              <w:rPr>
+                <w:sz w:val="21"/>
+              </w:rPr>
+              <w:t xml:space="preserve">    6.6 Model Design</w:t>
+            </w:r>
+          </w:p>
+        </w:tc>
+        <w:tc>
+          <w:tcPr>
+            <w:tcW w:type="dxa" w:w="1440"/>
+            <w:tcBorders>
+              <w:top w:val="none"/>
+              <w:left w:val="none"/>
+              <w:bottom w:val="none"/>
+              <w:right w:val="none"/>
+            </w:tcBorders>
+          </w:tcPr>
+          <w:p>
+            <w:pPr>
+              <w:spacing w:before="20" w:after="40"/>
+              <w:jc w:val="right"/>
+            </w:pPr>
+            <w:r>
+              <w:rPr>
+                <w:sz w:val="21"/>
+              </w:rPr>
+              <w:t>16</w:t>
+            </w:r>
+          </w:p>
+        </w:tc>
+      </w:tr>
+      <w:tr>
+        <w:tc>
+          <w:tcPr>
+            <w:tcW w:type="dxa" w:w="7920"/>
+            <w:tcBorders>
+              <w:top w:val="none"/>
+              <w:left w:val="none"/>
+              <w:bottom w:val="none"/>
+              <w:right w:val="none"/>
+            </w:tcBorders>
+          </w:tcPr>
+          <w:p>
+            <w:pPr>
+              <w:spacing w:before="20" w:after="40"/>
+              <w:jc w:val="left"/>
+            </w:pPr>
+            <w:r>
+              <w:rPr>
+                <w:sz w:val="21"/>
+              </w:rPr>
+              <w:t xml:space="preserve">    6.7 Training and Evaluation</w:t>
+            </w:r>
+          </w:p>
+        </w:tc>
+        <w:tc>
+          <w:tcPr>
+            <w:tcW w:type="dxa" w:w="1440"/>
+            <w:tcBorders>
+              <w:top w:val="none"/>
+              <w:left w:val="none"/>
+              <w:bottom w:val="none"/>
+              <w:right w:val="none"/>
+            </w:tcBorders>
+          </w:tcPr>
+          <w:p>
+            <w:pPr>
+              <w:spacing w:before="20" w:after="40"/>
+              <w:jc w:val="right"/>
+            </w:pPr>
+            <w:r>
+              <w:rPr>
+                <w:sz w:val="21"/>
+              </w:rPr>
+              <w:t>16</w:t>
+            </w:r>
+          </w:p>
+        </w:tc>
+      </w:tr>
+      <w:tr>
+        <w:tc>
+          <w:tcPr>
+            <w:tcW w:type="dxa" w:w="7920"/>
+            <w:tcBorders>
+              <w:top w:val="none"/>
+              <w:left w:val="none"/>
+              <w:bottom w:val="none"/>
+              <w:right w:val="none"/>
+            </w:tcBorders>
+          </w:tcPr>
+          <w:p>
+            <w:pPr>
+              <w:spacing w:before="20" w:after="40"/>
+              <w:jc w:val="left"/>
+            </w:pPr>
+            <w:r>
+              <w:rPr>
+                <w:sz w:val="21"/>
+              </w:rPr>
+              <w:t xml:space="preserve">    6.8 Explainability</w:t>
+            </w:r>
+          </w:p>
+        </w:tc>
+        <w:tc>
+          <w:tcPr>
+            <w:tcW w:type="dxa" w:w="1440"/>
+            <w:tcBorders>
+              <w:top w:val="none"/>
+              <w:left w:val="none"/>
+              <w:bottom w:val="none"/>
+              <w:right w:val="none"/>
+            </w:tcBorders>
+          </w:tcPr>
+          <w:p>
+            <w:pPr>
+              <w:spacing w:before="20" w:after="40"/>
+              <w:jc w:val="right"/>
+            </w:pPr>
+            <w:r>
+              <w:rPr>
+                <w:sz w:val="21"/>
+              </w:rPr>
+              <w:t>17</w:t>
+            </w:r>
+          </w:p>
+        </w:tc>
+      </w:tr>
+      <w:tr>
+        <w:tc>
+          <w:tcPr>
+            <w:tcW w:type="dxa" w:w="7920"/>
+            <w:tcBorders>
+              <w:top w:val="none"/>
+              <w:left w:val="none"/>
+              <w:bottom w:val="none"/>
+              <w:right w:val="none"/>
+            </w:tcBorders>
+          </w:tcPr>
+          <w:p>
+            <w:pPr>
+              <w:spacing w:before="20" w:after="40"/>
+              <w:jc w:val="left"/>
+            </w:pPr>
+            <w:r>
+              <w:rPr>
+                <w:sz w:val="21"/>
+              </w:rPr>
+              <w:t xml:space="preserve">    6.9 Methodology Summary</w:t>
+            </w:r>
+          </w:p>
+        </w:tc>
+        <w:tc>
+          <w:tcPr>
+            <w:tcW w:type="dxa" w:w="1440"/>
+            <w:tcBorders>
+              <w:top w:val="none"/>
+              <w:left w:val="none"/>
+              <w:bottom w:val="none"/>
+              <w:right w:val="none"/>
+            </w:tcBorders>
+          </w:tcPr>
+          <w:p>
+            <w:pPr>
+              <w:spacing w:before="20" w:after="40"/>
+              <w:jc w:val="right"/>
+            </w:pPr>
+            <w:r>
+              <w:rPr>
+                <w:sz w:val="21"/>
+              </w:rPr>
+              <w:t>17</w:t>
+            </w:r>
+          </w:p>
+        </w:tc>
+      </w:tr>
+      <w:tr>
+        <w:tc>
+          <w:tcPr>
+            <w:tcW w:type="dxa" w:w="7920"/>
+            <w:tcBorders>
+              <w:top w:val="none"/>
+              <w:left w:val="none"/>
+              <w:bottom w:val="none"/>
+              <w:right w:val="none"/>
+            </w:tcBorders>
+          </w:tcPr>
+          <w:p>
+            <w:pPr>
+              <w:spacing w:before="20" w:after="40"/>
+              <w:jc w:val="left"/>
+            </w:pPr>
+            <w:r>
+              <w:rPr>
+                <w:b/>
+                <w:sz w:val="21"/>
+              </w:rPr>
+              <w:t>7. Implementation</w:t>
+            </w:r>
+          </w:p>
+        </w:tc>
+        <w:tc>
+          <w:tcPr>
+            <w:tcW w:type="dxa" w:w="1440"/>
+            <w:tcBorders>
+              <w:top w:val="none"/>
+              <w:left w:val="none"/>
+              <w:bottom w:val="none"/>
+              <w:right w:val="none"/>
+            </w:tcBorders>
+          </w:tcPr>
+          <w:p>
+            <w:pPr>
+              <w:spacing w:before="20" w:after="40"/>
+              <w:jc w:val="right"/>
+            </w:pPr>
+            <w:r>
+              <w:rPr>
+                <w:b/>
+                <w:sz w:val="21"/>
+              </w:rPr>
+              <w:t>18</w:t>
+            </w:r>
+          </w:p>
+        </w:tc>
+      </w:tr>
+      <w:tr>
+        <w:tc>
+          <w:tcPr>
+            <w:tcW w:type="dxa" w:w="7920"/>
+            <w:tcBorders>
+              <w:top w:val="none"/>
+              <w:left w:val="none"/>
+              <w:bottom w:val="none"/>
+              <w:right w:val="none"/>
+            </w:tcBorders>
+          </w:tcPr>
+          <w:p>
+            <w:pPr>
+              <w:spacing w:before="20" w:after="40"/>
+              <w:jc w:val="left"/>
+            </w:pPr>
+            <w:r>
+              <w:rPr>
+                <w:b/>
+                <w:sz w:val="21"/>
+              </w:rPr>
+              <w:t>8. Results and Discussion</w:t>
+            </w:r>
+          </w:p>
+        </w:tc>
+        <w:tc>
+          <w:tcPr>
+            <w:tcW w:type="dxa" w:w="1440"/>
+            <w:tcBorders>
+              <w:top w:val="none"/>
+              <w:left w:val="none"/>
+              <w:bottom w:val="none"/>
+              <w:right w:val="none"/>
+            </w:tcBorders>
+          </w:tcPr>
+          <w:p>
+            <w:pPr>
+              <w:spacing w:before="20" w:after="40"/>
+              <w:jc w:val="right"/>
+            </w:pPr>
+            <w:r>
+              <w:rPr>
+                <w:b/>
+                <w:sz w:val="21"/>
+              </w:rPr>
+              <w:t>19</w:t>
+            </w:r>
+          </w:p>
+        </w:tc>
+      </w:tr>
+      <w:tr>
+        <w:tc>
+          <w:tcPr>
+            <w:tcW w:type="dxa" w:w="7920"/>
+            <w:tcBorders>
+              <w:top w:val="none"/>
+              <w:left w:val="none"/>
+              <w:bottom w:val="none"/>
+              <w:right w:val="none"/>
+            </w:tcBorders>
+          </w:tcPr>
+          <w:p>
+            <w:pPr>
+              <w:spacing w:before="20" w:after="40"/>
+              <w:jc w:val="left"/>
+            </w:pPr>
+            <w:r>
+              <w:rPr>
+                <w:sz w:val="21"/>
+              </w:rPr>
+              <w:t xml:space="preserve">    8.1 Experimental Results</w:t>
+            </w:r>
+          </w:p>
+        </w:tc>
+        <w:tc>
+          <w:tcPr>
+            <w:tcW w:type="dxa" w:w="1440"/>
+            <w:tcBorders>
+              <w:top w:val="none"/>
+              <w:left w:val="none"/>
+              <w:bottom w:val="none"/>
+              <w:right w:val="none"/>
+            </w:tcBorders>
+          </w:tcPr>
+          <w:p>
+            <w:pPr>
+              <w:spacing w:before="20" w:after="40"/>
+              <w:jc w:val="right"/>
+            </w:pPr>
+            <w:r>
+              <w:rPr>
+                <w:sz w:val="21"/>
+              </w:rPr>
+              <w:t>19</w:t>
+            </w:r>
+          </w:p>
+        </w:tc>
+      </w:tr>
+      <w:tr>
+        <w:tc>
+          <w:tcPr>
+            <w:tcW w:type="dxa" w:w="7920"/>
+            <w:tcBorders>
+              <w:top w:val="none"/>
+              <w:left w:val="none"/>
+              <w:bottom w:val="none"/>
+              <w:right w:val="none"/>
+            </w:tcBorders>
+          </w:tcPr>
+          <w:p>
+            <w:pPr>
+              <w:spacing w:before="20" w:after="40"/>
+              <w:jc w:val="left"/>
+            </w:pPr>
+            <w:r>
+              <w:rPr>
+                <w:sz w:val="21"/>
+              </w:rPr>
+              <w:t xml:space="preserve">    8.2 Battery-Wise Generalization</w:t>
+            </w:r>
+          </w:p>
+        </w:tc>
+        <w:tc>
+          <w:tcPr>
+            <w:tcW w:type="dxa" w:w="1440"/>
+            <w:tcBorders>
+              <w:top w:val="none"/>
+              <w:left w:val="none"/>
+              <w:bottom w:val="none"/>
+              <w:right w:val="none"/>
+            </w:tcBorders>
+          </w:tcPr>
+          <w:p>
+            <w:pPr>
+              <w:spacing w:before="20" w:after="40"/>
+              <w:jc w:val="right"/>
+            </w:pPr>
+            <w:r>
+              <w:rPr>
+                <w:sz w:val="21"/>
+              </w:rPr>
+              <w:t>20</w:t>
+            </w:r>
+          </w:p>
+        </w:tc>
+      </w:tr>
+      <w:tr>
+        <w:tc>
+          <w:tcPr>
+            <w:tcW w:type="dxa" w:w="7920"/>
+            <w:tcBorders>
+              <w:top w:val="none"/>
+              <w:left w:val="none"/>
+              <w:bottom w:val="none"/>
+              <w:right w:val="none"/>
+            </w:tcBorders>
+          </w:tcPr>
+          <w:p>
+            <w:pPr>
+              <w:spacing w:before="20" w:after="40"/>
+              <w:jc w:val="left"/>
+            </w:pPr>
+            <w:r>
+              <w:rPr>
+                <w:sz w:val="21"/>
+              </w:rPr>
+              <w:t xml:space="preserve">    8.3 Explainability Results</w:t>
+            </w:r>
+          </w:p>
+        </w:tc>
+        <w:tc>
+          <w:tcPr>
+            <w:tcW w:type="dxa" w:w="1440"/>
+            <w:tcBorders>
+              <w:top w:val="none"/>
+              <w:left w:val="none"/>
+              <w:bottom w:val="none"/>
+              <w:right w:val="none"/>
+            </w:tcBorders>
+          </w:tcPr>
+          <w:p>
+            <w:pPr>
+              <w:spacing w:before="20" w:after="40"/>
+              <w:jc w:val="right"/>
+            </w:pPr>
+            <w:r>
+              <w:rPr>
+                <w:sz w:val="21"/>
+              </w:rPr>
+              <w:t>21</w:t>
+            </w:r>
+          </w:p>
+        </w:tc>
+      </w:tr>
+      <w:tr>
+        <w:tc>
+          <w:tcPr>
+            <w:tcW w:type="dxa" w:w="7920"/>
+            <w:tcBorders>
+              <w:top w:val="none"/>
+              <w:left w:val="none"/>
+              <w:bottom w:val="none"/>
+              <w:right w:val="none"/>
+            </w:tcBorders>
+          </w:tcPr>
+          <w:p>
+            <w:pPr>
+              <w:spacing w:before="20" w:after="40"/>
+              <w:jc w:val="left"/>
+            </w:pPr>
+            <w:r>
+              <w:rPr>
+                <w:sz w:val="21"/>
+              </w:rPr>
+              <w:t xml:space="preserve">    8.4 Discussion</w:t>
+            </w:r>
+          </w:p>
+        </w:tc>
+        <w:tc>
+          <w:tcPr>
+            <w:tcW w:type="dxa" w:w="1440"/>
+            <w:tcBorders>
+              <w:top w:val="none"/>
+              <w:left w:val="none"/>
+              <w:bottom w:val="none"/>
+              <w:right w:val="none"/>
+            </w:tcBorders>
+          </w:tcPr>
+          <w:p>
+            <w:pPr>
+              <w:spacing w:before="20" w:after="40"/>
+              <w:jc w:val="right"/>
+            </w:pPr>
+            <w:r>
+              <w:rPr>
+                <w:sz w:val="21"/>
+              </w:rPr>
+              <w:t>21</w:t>
+            </w:r>
+          </w:p>
+        </w:tc>
+      </w:tr>
+      <w:tr>
+        <w:tc>
+          <w:tcPr>
+            <w:tcW w:type="dxa" w:w="7920"/>
+            <w:tcBorders>
+              <w:top w:val="none"/>
+              <w:left w:val="none"/>
+              <w:bottom w:val="none"/>
+              <w:right w:val="none"/>
+            </w:tcBorders>
+          </w:tcPr>
+          <w:p>
+            <w:pPr>
+              <w:spacing w:before="20" w:after="40"/>
+              <w:jc w:val="left"/>
+            </w:pPr>
+            <w:r>
+              <w:rPr>
+                <w:b/>
+                <w:sz w:val="21"/>
+              </w:rPr>
+              <w:t>9. Conclusion and Future Work</w:t>
+            </w:r>
+          </w:p>
+        </w:tc>
+        <w:tc>
+          <w:tcPr>
+            <w:tcW w:type="dxa" w:w="1440"/>
+            <w:tcBorders>
+              <w:top w:val="none"/>
+              <w:left w:val="none"/>
+              <w:bottom w:val="none"/>
+              <w:right w:val="none"/>
+            </w:tcBorders>
+          </w:tcPr>
+          <w:p>
+            <w:pPr>
+              <w:spacing w:before="20" w:after="40"/>
+              <w:jc w:val="right"/>
+            </w:pPr>
+            <w:r>
+              <w:rPr>
+                <w:b/>
+                <w:sz w:val="21"/>
+              </w:rPr>
+              <w:t>22</w:t>
+            </w:r>
+          </w:p>
+        </w:tc>
+      </w:tr>
+      <w:tr>
+        <w:tc>
+          <w:tcPr>
+            <w:tcW w:type="dxa" w:w="7920"/>
+            <w:tcBorders>
+              <w:top w:val="none"/>
+              <w:left w:val="none"/>
+              <w:bottom w:val="none"/>
+              <w:right w:val="none"/>
+            </w:tcBorders>
+          </w:tcPr>
+          <w:p>
+            <w:pPr>
+              <w:spacing w:before="20" w:after="40"/>
+              <w:jc w:val="left"/>
+            </w:pPr>
+            <w:r>
+              <w:rPr>
+                <w:sz w:val="21"/>
+              </w:rPr>
+              <w:t xml:space="preserve">    9.1 Conclusion</w:t>
+            </w:r>
+          </w:p>
+        </w:tc>
+        <w:tc>
+          <w:tcPr>
+            <w:tcW w:type="dxa" w:w="1440"/>
+            <w:tcBorders>
+              <w:top w:val="none"/>
+              <w:left w:val="none"/>
+              <w:bottom w:val="none"/>
+              <w:right w:val="none"/>
+            </w:tcBorders>
+          </w:tcPr>
+          <w:p>
+            <w:pPr>
+              <w:spacing w:before="20" w:after="40"/>
+              <w:jc w:val="right"/>
+            </w:pPr>
+            <w:r>
+              <w:rPr>
+                <w:sz w:val="21"/>
+              </w:rPr>
+              <w:t>22</w:t>
+            </w:r>
+          </w:p>
+        </w:tc>
+      </w:tr>
+      <w:tr>
+        <w:tc>
+          <w:tcPr>
+            <w:tcW w:type="dxa" w:w="7920"/>
+            <w:tcBorders>
+              <w:top w:val="none"/>
+              <w:left w:val="none"/>
+              <w:bottom w:val="none"/>
+              <w:right w:val="none"/>
+            </w:tcBorders>
+          </w:tcPr>
+          <w:p>
+            <w:pPr>
+              <w:spacing w:before="20" w:after="40"/>
+              <w:jc w:val="left"/>
+            </w:pPr>
+            <w:r>
+              <w:rPr>
+                <w:sz w:val="21"/>
+              </w:rPr>
+              <w:t xml:space="preserve">    9.2 Limitations and Future Work</w:t>
+            </w:r>
+          </w:p>
+        </w:tc>
+        <w:tc>
+          <w:tcPr>
+            <w:tcW w:type="dxa" w:w="1440"/>
+            <w:tcBorders>
+              <w:top w:val="none"/>
+              <w:left w:val="none"/>
+              <w:bottom w:val="none"/>
+              <w:right w:val="none"/>
+            </w:tcBorders>
+          </w:tcPr>
+          <w:p>
+            <w:pPr>
+              <w:spacing w:before="20" w:after="40"/>
+              <w:jc w:val="right"/>
+            </w:pPr>
+            <w:r>
+              <w:rPr>
+                <w:sz w:val="21"/>
+              </w:rPr>
+              <w:t>22</w:t>
+            </w:r>
+          </w:p>
+        </w:tc>
+      </w:tr>
+      <w:tr>
+        <w:tc>
+          <w:tcPr>
+            <w:tcW w:type="dxa" w:w="7920"/>
+            <w:tcBorders>
+              <w:top w:val="none"/>
+              <w:left w:val="none"/>
+              <w:bottom w:val="none"/>
+              <w:right w:val="none"/>
+            </w:tcBorders>
+          </w:tcPr>
+          <w:p>
+            <w:pPr>
+              <w:spacing w:before="20" w:after="40"/>
+              <w:jc w:val="left"/>
+            </w:pPr>
+            <w:r>
+              <w:rPr>
+                <w:b/>
+                <w:sz w:val="21"/>
+              </w:rPr>
+              <w:t>10. References</w:t>
+            </w:r>
+          </w:p>
+        </w:tc>
+        <w:tc>
+          <w:tcPr>
+            <w:tcW w:type="dxa" w:w="1440"/>
+            <w:tcBorders>
+              <w:top w:val="none"/>
+              <w:left w:val="none"/>
+              <w:bottom w:val="none"/>
+              <w:right w:val="none"/>
+            </w:tcBorders>
+          </w:tcPr>
+          <w:p>
+            <w:pPr>
+              <w:spacing w:before="20" w:after="40"/>
+              <w:jc w:val="right"/>
+            </w:pPr>
+            <w:r>
+              <w:rPr>
+                <w:b/>
+                <w:sz w:val="21"/>
+              </w:rPr>
+              <w:t>23</w:t>
+            </w:r>
+          </w:p>
+        </w:tc>
+      </w:tr>
+    </w:tbl>
     <w:p>
       <w:pPr>
         <w:spacing w:before="320" w:after="120"/>
@@ -1456,131 +2649,262 @@
         <w:t>LIST OF TABLES</w:t>
       </w:r>
     </w:p>
-    <w:p>
-      <w:pPr>
-        <w:spacing w:after="40"/>
-      </w:pPr>
-      <w:r>
-        <w:rPr>
-          <w:sz w:val="20"/>
-        </w:rPr>
-        <w:t>Table 1. Comparison of Existing Approaches for Lithium-Ion Battery SoH Estimation</w:t>
-      </w:r>
-      <w:r>
-        <w:rPr>
-          <w:color w:val="94A3B8"/>
-          <w:sz w:val="19"/>
-        </w:rPr>
-        <w:t xml:space="preserve"> ..... </w:t>
-      </w:r>
-      <w:r>
-        <w:rPr>
-          <w:b/>
-          <w:sz w:val="20"/>
-        </w:rPr>
-        <w:t>11</w:t>
-      </w:r>
-    </w:p>
-    <w:p>
-      <w:pPr>
-        <w:spacing w:after="40"/>
-      </w:pPr>
-      <w:r>
-        <w:rPr>
-          <w:sz w:val="20"/>
-        </w:rPr>
-        <w:t>Table 8.1. Model Performance under Random Train-Test Split</w:t>
-      </w:r>
-      <w:r>
-        <w:rPr>
-          <w:color w:val="94A3B8"/>
-          <w:sz w:val="19"/>
-        </w:rPr>
-        <w:t xml:space="preserve"> ............ </w:t>
-      </w:r>
-      <w:r>
-        <w:rPr>
-          <w:b/>
-          <w:sz w:val="20"/>
-        </w:rPr>
-        <w:t>19</w:t>
-      </w:r>
-    </w:p>
-    <w:p>
-      <w:pPr>
-        <w:spacing w:after="40"/>
-      </w:pPr>
-      <w:r>
-        <w:rPr>
-          <w:sz w:val="20"/>
-        </w:rPr>
-        <w:t>Table 8.2. Machine-Learning Improvement over Baseline</w:t>
-      </w:r>
-      <w:r>
-        <w:rPr>
-          <w:color w:val="94A3B8"/>
-          <w:sz w:val="19"/>
-        </w:rPr>
-        <w:t xml:space="preserve"> ................. </w:t>
-      </w:r>
-      <w:r>
-        <w:rPr>
-          <w:b/>
-          <w:sz w:val="20"/>
-        </w:rPr>
-        <w:t>20</w:t>
-      </w:r>
-    </w:p>
-    <w:p>
-      <w:pPr>
-        <w:spacing w:after="40"/>
-      </w:pPr>
-      <w:r>
-        <w:rPr>
-          <w:sz w:val="20"/>
-        </w:rPr>
-        <w:t>Table 8.3. Random-Split versus Unseen-Battery Performance</w:t>
-      </w:r>
-      <w:r>
-        <w:rPr>
-          <w:color w:val="94A3B8"/>
-          <w:sz w:val="19"/>
-        </w:rPr>
-        <w:t xml:space="preserve"> ............. </w:t>
-      </w:r>
-      <w:r>
-        <w:rPr>
-          <w:b/>
-          <w:sz w:val="20"/>
-        </w:rPr>
-        <w:t>20</w:t>
-      </w:r>
-    </w:p>
-    <w:p>
-      <w:pPr>
-        <w:spacing w:after="40"/>
-      </w:pPr>
-      <w:r>
-        <w:rPr>
-          <w:sz w:val="20"/>
-        </w:rPr>
-        <w:t>Table 8.4. Top Features from Permutation Importance</w:t>
-      </w:r>
-      <w:r>
-        <w:rPr>
-          <w:color w:val="94A3B8"/>
-          <w:sz w:val="19"/>
-        </w:rPr>
-        <w:t xml:space="preserve"> ................... </w:t>
-      </w:r>
-      <w:r>
-        <w:rPr>
-          <w:b/>
-          <w:sz w:val="20"/>
-        </w:rPr>
-        <w:t>21</w:t>
-      </w:r>
-    </w:p>
+    <w:tbl>
+      <w:tblPr>
+        <w:tblW w:type="auto" w:w="0"/>
+        <w:jc w:val="center"/>
+        <w:tblLook w:firstColumn="1" w:firstRow="1" w:lastColumn="0" w:lastRow="0" w:noHBand="0" w:noVBand="1" w:val="04A0"/>
+      </w:tblPr>
+      <w:tblGrid>
+        <w:gridCol w:w="4680"/>
+        <w:gridCol w:w="4680"/>
+      </w:tblGrid>
+      <w:tr>
+        <w:tc>
+          <w:tcPr>
+            <w:tcW w:type="dxa" w:w="7920"/>
+            <w:tcBorders>
+              <w:top w:val="none"/>
+              <w:left w:val="none"/>
+              <w:bottom w:val="none"/>
+              <w:right w:val="none"/>
+            </w:tcBorders>
+          </w:tcPr>
+          <w:p>
+            <w:pPr>
+              <w:spacing w:after="40"/>
+              <w:jc w:val="left"/>
+            </w:pPr>
+            <w:r>
+              <w:rPr>
+                <w:sz w:val="20"/>
+              </w:rPr>
+              <w:t>Table 1. Comparison of Existing Approaches for Lithium-Ion Battery SoH Estimation</w:t>
+            </w:r>
+          </w:p>
+        </w:tc>
+        <w:tc>
+          <w:tcPr>
+            <w:tcW w:type="dxa" w:w="1440"/>
+            <w:tcBorders>
+              <w:top w:val="none"/>
+              <w:left w:val="none"/>
+              <w:bottom w:val="none"/>
+              <w:right w:val="none"/>
+            </w:tcBorders>
+          </w:tcPr>
+          <w:p>
+            <w:pPr>
+              <w:spacing w:after="40"/>
+              <w:jc w:val="right"/>
+            </w:pPr>
+            <w:r>
+              <w:rPr>
+                <w:b/>
+                <w:sz w:val="20"/>
+              </w:rPr>
+              <w:t>11</w:t>
+            </w:r>
+          </w:p>
+        </w:tc>
+      </w:tr>
+      <w:tr>
+        <w:tc>
+          <w:tcPr>
+            <w:tcW w:type="dxa" w:w="7920"/>
+            <w:tcBorders>
+              <w:top w:val="none"/>
+              <w:left w:val="none"/>
+              <w:bottom w:val="none"/>
+              <w:right w:val="none"/>
+            </w:tcBorders>
+          </w:tcPr>
+          <w:p>
+            <w:pPr>
+              <w:spacing w:after="40"/>
+              <w:jc w:val="left"/>
+            </w:pPr>
+            <w:r>
+              <w:rPr>
+                <w:sz w:val="20"/>
+              </w:rPr>
+              <w:t>Table 8.1. Model Performance under Random Train-Test Split</w:t>
+            </w:r>
+          </w:p>
+        </w:tc>
+        <w:tc>
+          <w:tcPr>
+            <w:tcW w:type="dxa" w:w="1440"/>
+            <w:tcBorders>
+              <w:top w:val="none"/>
+              <w:left w:val="none"/>
+              <w:bottom w:val="none"/>
+              <w:right w:val="none"/>
+            </w:tcBorders>
+          </w:tcPr>
+          <w:p>
+            <w:pPr>
+              <w:spacing w:after="40"/>
+              <w:jc w:val="right"/>
+            </w:pPr>
+            <w:r>
+              <w:rPr>
+                <w:b/>
+                <w:sz w:val="20"/>
+              </w:rPr>
+              <w:t>19</w:t>
+            </w:r>
+          </w:p>
+        </w:tc>
+      </w:tr>
+      <w:tr>
+        <w:tc>
+          <w:tcPr>
+            <w:tcW w:type="dxa" w:w="7920"/>
+            <w:tcBorders>
+              <w:top w:val="none"/>
+              <w:left w:val="none"/>
+              <w:bottom w:val="none"/>
+              <w:right w:val="none"/>
+            </w:tcBorders>
+          </w:tcPr>
+          <w:p>
+            <w:pPr>
+              <w:spacing w:after="40"/>
+              <w:jc w:val="left"/>
+            </w:pPr>
+            <w:r>
+              <w:rPr>
+                <w:sz w:val="20"/>
+              </w:rPr>
+              <w:t>Table 8.2. Machine-Learning Improvement over Baseline</w:t>
+            </w:r>
+          </w:p>
+        </w:tc>
+        <w:tc>
+          <w:tcPr>
+            <w:tcW w:type="dxa" w:w="1440"/>
+            <w:tcBorders>
+              <w:top w:val="none"/>
+              <w:left w:val="none"/>
+              <w:bottom w:val="none"/>
+              <w:right w:val="none"/>
+            </w:tcBorders>
+          </w:tcPr>
+          <w:p>
+            <w:pPr>
+              <w:spacing w:after="40"/>
+              <w:jc w:val="right"/>
+            </w:pPr>
+            <w:r>
+              <w:rPr>
+                <w:b/>
+                <w:sz w:val="20"/>
+              </w:rPr>
+              <w:t>20</w:t>
+            </w:r>
+          </w:p>
+        </w:tc>
+      </w:tr>
+      <w:tr>
+        <w:tc>
+          <w:tcPr>
+            <w:tcW w:type="dxa" w:w="7920"/>
+            <w:tcBorders>
+              <w:top w:val="none"/>
+              <w:left w:val="none"/>
+              <w:bottom w:val="none"/>
+              <w:right w:val="none"/>
+            </w:tcBorders>
+          </w:tcPr>
+          <w:p>
+            <w:pPr>
+              <w:spacing w:after="40"/>
+              <w:jc w:val="left"/>
+            </w:pPr>
+            <w:r>
+              <w:rPr>
+                <w:sz w:val="20"/>
+              </w:rPr>
+              <w:t>Table 8.3. Random-Split versus Unseen-Battery Performance</w:t>
+            </w:r>
+          </w:p>
+        </w:tc>
+        <w:tc>
+          <w:tcPr>
+            <w:tcW w:type="dxa" w:w="1440"/>
+            <w:tcBorders>
+              <w:top w:val="none"/>
+              <w:left w:val="none"/>
+              <w:bottom w:val="none"/>
+              <w:right w:val="none"/>
+            </w:tcBorders>
+          </w:tcPr>
+          <w:p>
+            <w:pPr>
+              <w:spacing w:after="40"/>
+              <w:jc w:val="right"/>
+            </w:pPr>
+            <w:r>
+              <w:rPr>
+                <w:b/>
+                <w:sz w:val="20"/>
+              </w:rPr>
+              <w:t>20</w:t>
+            </w:r>
+          </w:p>
+        </w:tc>
+      </w:tr>
+      <w:tr>
+        <w:tc>
+          <w:tcPr>
+            <w:tcW w:type="dxa" w:w="7920"/>
+            <w:tcBorders>
+              <w:top w:val="none"/>
+              <w:left w:val="none"/>
+              <w:bottom w:val="none"/>
+              <w:right w:val="none"/>
+            </w:tcBorders>
+          </w:tcPr>
+          <w:p>
+            <w:pPr>
+              <w:spacing w:after="40"/>
+              <w:jc w:val="left"/>
+            </w:pPr>
+            <w:r>
+              <w:rPr>
+                <w:sz w:val="20"/>
+              </w:rPr>
+              <w:t>Table 8.4. Top Features from Permutation Importance</w:t>
+            </w:r>
+          </w:p>
+        </w:tc>
+        <w:tc>
+          <w:tcPr>
+            <w:tcW w:type="dxa" w:w="1440"/>
+            <w:tcBorders>
+              <w:top w:val="none"/>
+              <w:left w:val="none"/>
+              <w:bottom w:val="none"/>
+              <w:right w:val="none"/>
+            </w:tcBorders>
+          </w:tcPr>
+          <w:p>
+            <w:pPr>
+              <w:spacing w:after="40"/>
+              <w:jc w:val="right"/>
+            </w:pPr>
+            <w:r>
+              <w:rPr>
+                <w:b/>
+                <w:sz w:val="20"/>
+              </w:rPr>
+              <w:t>21</w:t>
+            </w:r>
+          </w:p>
+        </w:tc>
+      </w:tr>
+    </w:tbl>
     <w:p>
       <w:pPr>
         <w:spacing w:before="280" w:after="120"/>
@@ -1593,181 +2917,360 @@
         <w:t>LIST OF FIGURES</w:t>
       </w:r>
     </w:p>
-    <w:p>
-      <w:pPr>
-        <w:spacing w:after="40"/>
-      </w:pPr>
-      <w:r>
-        <w:rPr>
-          <w:sz w:val="20"/>
-        </w:rPr>
-        <w:t>Figure 1. Overall methodology for SOH prediction using Random Forest with Bayesian Optimization</w:t>
-      </w:r>
-      <w:r>
-        <w:rPr>
-          <w:color w:val="94A3B8"/>
-          <w:sz w:val="19"/>
-        </w:rPr>
-        <w:t xml:space="preserve"> ..... </w:t>
-      </w:r>
-      <w:r>
-        <w:rPr>
-          <w:b/>
-          <w:sz w:val="20"/>
-        </w:rPr>
-        <w:t>14</w:t>
-      </w:r>
-    </w:p>
-    <w:p>
-      <w:pPr>
-        <w:spacing w:after="40"/>
-      </w:pPr>
-      <w:r>
-        <w:rPr>
-          <w:sz w:val="20"/>
-        </w:rPr>
-        <w:t>Figure 2. Random Forest regression process</w:t>
-      </w:r>
-      <w:r>
-        <w:rPr>
-          <w:color w:val="94A3B8"/>
-          <w:sz w:val="19"/>
-        </w:rPr>
-        <w:t xml:space="preserve"> ............................ </w:t>
-      </w:r>
-      <w:r>
-        <w:rPr>
-          <w:b/>
-          <w:sz w:val="20"/>
-        </w:rPr>
-        <w:t>16</w:t>
-      </w:r>
-    </w:p>
-    <w:p>
-      <w:pPr>
-        <w:spacing w:after="40"/>
-      </w:pPr>
-      <w:r>
-        <w:rPr>
-          <w:sz w:val="20"/>
-        </w:rPr>
-        <w:t>Figure 3. Bayesian optimization process for hyperparameter tuning</w:t>
-      </w:r>
-      <w:r>
-        <w:rPr>
-          <w:color w:val="94A3B8"/>
-          <w:sz w:val="19"/>
-        </w:rPr>
-        <w:t xml:space="preserve"> ..... </w:t>
-      </w:r>
-      <w:r>
-        <w:rPr>
-          <w:b/>
-          <w:sz w:val="20"/>
-        </w:rPr>
-        <w:t>16</w:t>
-      </w:r>
-    </w:p>
-    <w:p>
-      <w:pPr>
-        <w:spacing w:after="40"/>
-      </w:pPr>
-      <w:r>
-        <w:rPr>
-          <w:sz w:val="20"/>
-        </w:rPr>
-        <w:t>Figure 8.1. Battery degradation under randomized usage</w:t>
-      </w:r>
-      <w:r>
-        <w:rPr>
-          <w:color w:val="94A3B8"/>
-          <w:sz w:val="19"/>
-        </w:rPr>
-        <w:t xml:space="preserve"> ................ </w:t>
-      </w:r>
-      <w:r>
-        <w:rPr>
-          <w:b/>
-          <w:sz w:val="20"/>
-        </w:rPr>
-        <w:t>19</w:t>
-      </w:r>
-    </w:p>
-    <w:p>
-      <w:pPr>
-        <w:spacing w:after="40"/>
-      </w:pPr>
-      <w:r>
-        <w:rPr>
-          <w:sz w:val="20"/>
-        </w:rPr>
-        <w:t>Figure 8.2. Actual versus predicted SoH</w:t>
-      </w:r>
-      <w:r>
-        <w:rPr>
-          <w:color w:val="94A3B8"/>
-          <w:sz w:val="19"/>
-        </w:rPr>
-        <w:t xml:space="preserve"> ............................... </w:t>
-      </w:r>
-      <w:r>
-        <w:rPr>
-          <w:b/>
-          <w:sz w:val="20"/>
-        </w:rPr>
-        <w:t>19</w:t>
-      </w:r>
-    </w:p>
-    <w:p>
-      <w:pPr>
-        <w:spacing w:after="40"/>
-      </w:pPr>
-      <w:r>
-        <w:rPr>
-          <w:sz w:val="20"/>
-        </w:rPr>
-        <w:t>Figure 8.3. Permutation importance of operating-history features</w:t>
-      </w:r>
-      <w:r>
-        <w:rPr>
-          <w:color w:val="94A3B8"/>
-          <w:sz w:val="19"/>
-        </w:rPr>
-        <w:t xml:space="preserve"> ...... </w:t>
-      </w:r>
-      <w:r>
-        <w:rPr>
-          <w:b/>
-          <w:sz w:val="20"/>
-        </w:rPr>
-        <w:t>21</w:t>
-      </w:r>
-    </w:p>
-    <w:p>
-      <w:pPr>
-        <w:spacing w:after="40"/>
-      </w:pPr>
-      <w:r>
-        <w:rPr>
-          <w:sz w:val="20"/>
-        </w:rPr>
-        <w:t>Figure 8.4. SHAP explanation of SoH predictions</w:t>
-      </w:r>
-      <w:r>
-        <w:rPr>
-          <w:color w:val="94A3B8"/>
-          <w:sz w:val="19"/>
-        </w:rPr>
-        <w:t xml:space="preserve"> ....................... </w:t>
-      </w:r>
-      <w:r>
-        <w:rPr>
-          <w:b/>
-          <w:sz w:val="20"/>
-        </w:rPr>
-        <w:t>21</w:t>
-      </w:r>
-    </w:p>
+    <w:tbl>
+      <w:tblPr>
+        <w:tblW w:type="auto" w:w="0"/>
+        <w:jc w:val="center"/>
+        <w:tblLook w:firstColumn="1" w:firstRow="1" w:lastColumn="0" w:lastRow="0" w:noHBand="0" w:noVBand="1" w:val="04A0"/>
+      </w:tblPr>
+      <w:tblGrid>
+        <w:gridCol w:w="4680"/>
+        <w:gridCol w:w="4680"/>
+      </w:tblGrid>
+      <w:tr>
+        <w:tc>
+          <w:tcPr>
+            <w:tcW w:type="dxa" w:w="7920"/>
+            <w:tcBorders>
+              <w:top w:val="none"/>
+              <w:left w:val="none"/>
+              <w:bottom w:val="none"/>
+              <w:right w:val="none"/>
+            </w:tcBorders>
+          </w:tcPr>
+          <w:p>
+            <w:pPr>
+              <w:spacing w:after="40"/>
+              <w:jc w:val="left"/>
+            </w:pPr>
+            <w:r>
+              <w:rPr>
+                <w:sz w:val="20"/>
+              </w:rPr>
+              <w:t>Figure 1. Overall methodology for SOH prediction using Random Forest with Bayesian Optimization</w:t>
+            </w:r>
+          </w:p>
+        </w:tc>
+        <w:tc>
+          <w:tcPr>
+            <w:tcW w:type="dxa" w:w="1440"/>
+            <w:tcBorders>
+              <w:top w:val="none"/>
+              <w:left w:val="none"/>
+              <w:bottom w:val="none"/>
+              <w:right w:val="none"/>
+            </w:tcBorders>
+          </w:tcPr>
+          <w:p>
+            <w:pPr>
+              <w:spacing w:after="40"/>
+              <w:jc w:val="right"/>
+            </w:pPr>
+            <w:r>
+              <w:rPr>
+                <w:b/>
+                <w:sz w:val="20"/>
+              </w:rPr>
+              <w:t>14</w:t>
+            </w:r>
+          </w:p>
+        </w:tc>
+      </w:tr>
+      <w:tr>
+        <w:tc>
+          <w:tcPr>
+            <w:tcW w:type="dxa" w:w="7920"/>
+            <w:tcBorders>
+              <w:top w:val="none"/>
+              <w:left w:val="none"/>
+              <w:bottom w:val="none"/>
+              <w:right w:val="none"/>
+            </w:tcBorders>
+          </w:tcPr>
+          <w:p>
+            <w:pPr>
+              <w:spacing w:after="40"/>
+              <w:jc w:val="left"/>
+            </w:pPr>
+            <w:r>
+              <w:rPr>
+                <w:sz w:val="20"/>
+              </w:rPr>
+              <w:t>Figure 2. Random Forest regression process</w:t>
+            </w:r>
+          </w:p>
+        </w:tc>
+        <w:tc>
+          <w:tcPr>
+            <w:tcW w:type="dxa" w:w="1440"/>
+            <w:tcBorders>
+              <w:top w:val="none"/>
+              <w:left w:val="none"/>
+              <w:bottom w:val="none"/>
+              <w:right w:val="none"/>
+            </w:tcBorders>
+          </w:tcPr>
+          <w:p>
+            <w:pPr>
+              <w:spacing w:after="40"/>
+              <w:jc w:val="right"/>
+            </w:pPr>
+            <w:r>
+              <w:rPr>
+                <w:b/>
+                <w:sz w:val="20"/>
+              </w:rPr>
+              <w:t>16</w:t>
+            </w:r>
+          </w:p>
+        </w:tc>
+      </w:tr>
+      <w:tr>
+        <w:tc>
+          <w:tcPr>
+            <w:tcW w:type="dxa" w:w="7920"/>
+            <w:tcBorders>
+              <w:top w:val="none"/>
+              <w:left w:val="none"/>
+              <w:bottom w:val="none"/>
+              <w:right w:val="none"/>
+            </w:tcBorders>
+          </w:tcPr>
+          <w:p>
+            <w:pPr>
+              <w:spacing w:after="40"/>
+              <w:jc w:val="left"/>
+            </w:pPr>
+            <w:r>
+              <w:rPr>
+                <w:sz w:val="20"/>
+              </w:rPr>
+              <w:t>Figure 3. Bayesian optimization process for hyperparameter tuning</w:t>
+            </w:r>
+          </w:p>
+        </w:tc>
+        <w:tc>
+          <w:tcPr>
+            <w:tcW w:type="dxa" w:w="1440"/>
+            <w:tcBorders>
+              <w:top w:val="none"/>
+              <w:left w:val="none"/>
+              <w:bottom w:val="none"/>
+              <w:right w:val="none"/>
+            </w:tcBorders>
+          </w:tcPr>
+          <w:p>
+            <w:pPr>
+              <w:spacing w:after="40"/>
+              <w:jc w:val="right"/>
+            </w:pPr>
+            <w:r>
+              <w:rPr>
+                <w:b/>
+                <w:sz w:val="20"/>
+              </w:rPr>
+              <w:t>16</w:t>
+            </w:r>
+          </w:p>
+        </w:tc>
+      </w:tr>
+      <w:tr>
+        <w:tc>
+          <w:tcPr>
+            <w:tcW w:type="dxa" w:w="7920"/>
+            <w:tcBorders>
+              <w:top w:val="none"/>
+              <w:left w:val="none"/>
+              <w:bottom w:val="none"/>
+              <w:right w:val="none"/>
+            </w:tcBorders>
+          </w:tcPr>
+          <w:p>
+            <w:pPr>
+              <w:spacing w:after="40"/>
+              <w:jc w:val="left"/>
+            </w:pPr>
+            <w:r>
+              <w:rPr>
+                <w:sz w:val="20"/>
+              </w:rPr>
+              <w:t>Figure 8.1. Battery degradation under randomized usage</w:t>
+            </w:r>
+          </w:p>
+        </w:tc>
+        <w:tc>
+          <w:tcPr>
+            <w:tcW w:type="dxa" w:w="1440"/>
+            <w:tcBorders>
+              <w:top w:val="none"/>
+              <w:left w:val="none"/>
+              <w:bottom w:val="none"/>
+              <w:right w:val="none"/>
+            </w:tcBorders>
+          </w:tcPr>
+          <w:p>
+            <w:pPr>
+              <w:spacing w:after="40"/>
+              <w:jc w:val="right"/>
+            </w:pPr>
+            <w:r>
+              <w:rPr>
+                <w:b/>
+                <w:sz w:val="20"/>
+              </w:rPr>
+              <w:t>19</w:t>
+            </w:r>
+          </w:p>
+        </w:tc>
+      </w:tr>
+      <w:tr>
+        <w:tc>
+          <w:tcPr>
+            <w:tcW w:type="dxa" w:w="7920"/>
+            <w:tcBorders>
+              <w:top w:val="none"/>
+              <w:left w:val="none"/>
+              <w:bottom w:val="none"/>
+              <w:right w:val="none"/>
+            </w:tcBorders>
+          </w:tcPr>
+          <w:p>
+            <w:pPr>
+              <w:spacing w:after="40"/>
+              <w:jc w:val="left"/>
+            </w:pPr>
+            <w:r>
+              <w:rPr>
+                <w:sz w:val="20"/>
+              </w:rPr>
+              <w:t>Figure 8.2. Actual versus predicted SoH</w:t>
+            </w:r>
+          </w:p>
+        </w:tc>
+        <w:tc>
+          <w:tcPr>
+            <w:tcW w:type="dxa" w:w="1440"/>
+            <w:tcBorders>
+              <w:top w:val="none"/>
+              <w:left w:val="none"/>
+              <w:bottom w:val="none"/>
+              <w:right w:val="none"/>
+            </w:tcBorders>
+          </w:tcPr>
+          <w:p>
+            <w:pPr>
+              <w:spacing w:after="40"/>
+              <w:jc w:val="right"/>
+            </w:pPr>
+            <w:r>
+              <w:rPr>
+                <w:b/>
+                <w:sz w:val="20"/>
+              </w:rPr>
+              <w:t>19</w:t>
+            </w:r>
+          </w:p>
+        </w:tc>
+      </w:tr>
+      <w:tr>
+        <w:tc>
+          <w:tcPr>
+            <w:tcW w:type="dxa" w:w="7920"/>
+            <w:tcBorders>
+              <w:top w:val="none"/>
+              <w:left w:val="none"/>
+              <w:bottom w:val="none"/>
+              <w:right w:val="none"/>
+            </w:tcBorders>
+          </w:tcPr>
+          <w:p>
+            <w:pPr>
+              <w:spacing w:after="40"/>
+              <w:jc w:val="left"/>
+            </w:pPr>
+            <w:r>
+              <w:rPr>
+                <w:sz w:val="20"/>
+              </w:rPr>
+              <w:t>Figure 8.3. Permutation importance of operating-history features</w:t>
+            </w:r>
+          </w:p>
+        </w:tc>
+        <w:tc>
+          <w:tcPr>
+            <w:tcW w:type="dxa" w:w="1440"/>
+            <w:tcBorders>
+              <w:top w:val="none"/>
+              <w:left w:val="none"/>
+              <w:bottom w:val="none"/>
+              <w:right w:val="none"/>
+            </w:tcBorders>
+          </w:tcPr>
+          <w:p>
+            <w:pPr>
+              <w:spacing w:after="40"/>
+              <w:jc w:val="right"/>
+            </w:pPr>
+            <w:r>
+              <w:rPr>
+                <w:b/>
+                <w:sz w:val="20"/>
+              </w:rPr>
+              <w:t>21</w:t>
+            </w:r>
+          </w:p>
+        </w:tc>
+      </w:tr>
+      <w:tr>
+        <w:tc>
+          <w:tcPr>
+            <w:tcW w:type="dxa" w:w="7920"/>
+            <w:tcBorders>
+              <w:top w:val="none"/>
+              <w:left w:val="none"/>
+              <w:bottom w:val="none"/>
+              <w:right w:val="none"/>
+            </w:tcBorders>
+          </w:tcPr>
+          <w:p>
+            <w:pPr>
+              <w:spacing w:after="40"/>
+              <w:jc w:val="left"/>
+            </w:pPr>
+            <w:r>
+              <w:rPr>
+                <w:sz w:val="20"/>
+              </w:rPr>
+              <w:t>Figure 8.4. SHAP explanation of SoH predictions</w:t>
+            </w:r>
+          </w:p>
+        </w:tc>
+        <w:tc>
+          <w:tcPr>
+            <w:tcW w:type="dxa" w:w="1440"/>
+            <w:tcBorders>
+              <w:top w:val="none"/>
+              <w:left w:val="none"/>
+              <w:bottom w:val="none"/>
+              <w:right w:val="none"/>
+            </w:tcBorders>
+          </w:tcPr>
+          <w:p>
+            <w:pPr>
+              <w:spacing w:after="40"/>
+              <w:jc w:val="right"/>
+            </w:pPr>
+            <w:r>
+              <w:rPr>
+                <w:b/>
+                <w:sz w:val="20"/>
+              </w:rPr>
+              <w:t>21</w:t>
+            </w:r>
+          </w:p>
+        </w:tc>
+      </w:tr>
+    </w:tbl>
     <w:p>
       <w:r>
         <w:br w:type="page"/>
@@ -4519,7 +6022,7 @@
         <w:rPr>
           <w:sz w:val="23"/>
         </w:rPr>
-        <w:t>The project evaluates six regression algorithms covering linear baselines and non-linear ensembles: Linear Regression, Ridge, Elastic Net, Random Forest, Extra Trees, and Gradient Boosting.</w:t>
+        <w:t>The project evaluates six regression algorithms covering linear baselines and non-linear ensembles: Linear Regression, Ridge, Elastic Net, Random Forest, Extra Trees, and Gradient Boosting. Figure 2 illustrates the Random Forest decision tree ensemble mechanism for aggregating multi-tree predictions into a robust SoH estimate.</w:t>
       </w:r>
     </w:p>
     <w:p>
@@ -4577,6 +6080,18 @@
           <w:sz w:val="20"/>
         </w:rPr>
         <w:t>Figure 2. Random Forest regression process</w:t>
+      </w:r>
+    </w:p>
+    <w:p>
+      <w:pPr>
+        <w:spacing w:after="120" w:line="276" w:lineRule="auto"/>
+        <w:jc w:val="both"/>
+      </w:pPr>
+      <w:r>
+        <w:rPr>
+          <w:sz w:val="23"/>
+        </w:rPr>
+        <w:t>To identify optimal hyperparameter configurations efficiently across tree depth, estimator counts, and learning rates, Bayesian Optimization with Gaussian Process surrogates is employed, as illustrated in Figure 3.</w:t>
       </w:r>
     </w:p>
     <w:p>

</xml_diff>